<commit_message>
fix: alinhar DER ao schema do MVP
</commit_message>
<xml_diff>
--- a/docs/Marcelo Chaves de Miranda - CONSTRUMOB - revisado.docx
+++ b/docs/Marcelo Chaves de Miranda - CONSTRUMOB - revisado.docx
@@ -4218,7 +4218,7 @@
         <w:rPr>
           <w:sz w:val="16"/>
         </w:rPr>
-        <w:t xml:space="preserve"> 37</w:t>
+        <w:t xml:space="preserve"> 38</w:t>
       </w:r>
     </w:p>
     <w:p>
@@ -19544,496 +19544,117 @@
       <w:r>
         <w:rPr>
           <w:rFonts w:ascii="Consolas" w:hAnsi="Consolas"/>
-          <w:sz w:val="14"/>
         </w:rPr>
         <w:t>@startuml</w:t>
         <w:br/>
-      </w:r>
-      <w:r>
-        <w:rPr>
-          <w:rFonts w:ascii="Consolas" w:hAnsi="Consolas"/>
-          <w:sz w:val="14"/>
-        </w:rPr>
-        <w:t>title DER — CONSTRUMOB MVP</w:t>
-        <w:br/>
-      </w:r>
-      <w:r>
-        <w:rPr>
-          <w:rFonts w:ascii="Consolas" w:hAnsi="Consolas"/>
-          <w:sz w:val="14"/>
-        </w:rPr>
-        <w:t>hide methods</w:t>
-        <w:br/>
-      </w:r>
-      <w:r>
-        <w:rPr>
-          <w:rFonts w:ascii="Consolas" w:hAnsi="Consolas"/>
-          <w:sz w:val="14"/>
-        </w:rPr>
-        <w:t>hide stereotypes</w:t>
-        <w:br/>
-      </w:r>
-      <w:r>
-        <w:rPr>
-          <w:rFonts w:ascii="Consolas" w:hAnsi="Consolas"/>
-          <w:sz w:val="14"/>
-        </w:rPr>
+        <w:t>title DER - CONSTRUMOB MVP</w:t>
+        <w:br/>
+        <w:br/>
         <w:t>entity CLIENTE {</w:t>
         <w:br/>
-      </w:r>
-      <w:r>
-        <w:rPr>
-          <w:rFonts w:ascii="Consolas" w:hAnsi="Consolas"/>
-          <w:sz w:val="14"/>
-        </w:rPr>
-        <w:t xml:space="preserve"> * id : BIGINT &lt;&lt;PK&gt;&gt;</w:t>
-        <w:br/>
-      </w:r>
-      <w:r>
-        <w:rPr>
-          <w:rFonts w:ascii="Consolas" w:hAnsi="Consolas"/>
-          <w:sz w:val="14"/>
-        </w:rPr>
-        <w:t xml:space="preserve"> --</w:t>
-        <w:br/>
-      </w:r>
-      <w:r>
-        <w:rPr>
-          <w:rFonts w:ascii="Consolas" w:hAnsi="Consolas"/>
-          <w:sz w:val="14"/>
-        </w:rPr>
-        <w:t xml:space="preserve"> nome : VARCHAR(120)</w:t>
-        <w:br/>
-      </w:r>
-      <w:r>
-        <w:rPr>
-          <w:rFonts w:ascii="Consolas" w:hAnsi="Consolas"/>
-          <w:sz w:val="14"/>
-        </w:rPr>
-        <w:t xml:space="preserve"> email : VARCHAR(160) &lt;&lt;UQ&gt;&gt;</w:t>
-        <w:br/>
-      </w:r>
-      <w:r>
-        <w:rPr>
-          <w:rFonts w:ascii="Consolas" w:hAnsi="Consolas"/>
-          <w:sz w:val="14"/>
-        </w:rPr>
-        <w:t xml:space="preserve"> telefone : VARCHAR(30)</w:t>
-        <w:br/>
-      </w:r>
-      <w:r>
-        <w:rPr>
-          <w:rFonts w:ascii="Consolas" w:hAnsi="Consolas"/>
-          <w:sz w:val="14"/>
-        </w:rPr>
+        <w:t xml:space="preserve">  id : BIGINT PK</w:t>
+        <w:br/>
+        <w:t xml:space="preserve">  nome : VARCHAR(120)</w:t>
+        <w:br/>
+        <w:t xml:space="preserve">  email : VARCHAR(160) UNIQUE</w:t>
+        <w:br/>
+        <w:t xml:space="preserve">  telefone : VARCHAR(20)</w:t>
+        <w:br/>
         <w:t>}</w:t>
         <w:br/>
-      </w:r>
-      <w:r>
-        <w:rPr>
-          <w:rFonts w:ascii="Consolas" w:hAnsi="Consolas"/>
-          <w:sz w:val="14"/>
-        </w:rPr>
+        <w:br/>
         <w:t>entity PROFISSIONAL {</w:t>
         <w:br/>
-      </w:r>
-      <w:r>
-        <w:rPr>
-          <w:rFonts w:ascii="Consolas" w:hAnsi="Consolas"/>
-          <w:sz w:val="14"/>
-        </w:rPr>
-        <w:t xml:space="preserve"> * id : BIGINT &lt;&lt;PK&gt;&gt;</w:t>
-        <w:br/>
-      </w:r>
-      <w:r>
-        <w:rPr>
-          <w:rFonts w:ascii="Consolas" w:hAnsi="Consolas"/>
-          <w:sz w:val="14"/>
-        </w:rPr>
-        <w:t xml:space="preserve"> --</w:t>
-        <w:br/>
-      </w:r>
-      <w:r>
-        <w:rPr>
-          <w:rFonts w:ascii="Consolas" w:hAnsi="Consolas"/>
-          <w:sz w:val="14"/>
-        </w:rPr>
-        <w:t xml:space="preserve"> nome : VARCHAR(120)</w:t>
-        <w:br/>
-      </w:r>
-      <w:r>
-        <w:rPr>
-          <w:rFonts w:ascii="Consolas" w:hAnsi="Consolas"/>
-          <w:sz w:val="14"/>
-        </w:rPr>
-        <w:t xml:space="preserve"> email : VARCHAR(160) &lt;&lt;UQ&gt;&gt;</w:t>
-        <w:br/>
-      </w:r>
-      <w:r>
-        <w:rPr>
-          <w:rFonts w:ascii="Consolas" w:hAnsi="Consolas"/>
-          <w:sz w:val="14"/>
-        </w:rPr>
-        <w:t xml:space="preserve"> especialidade : VARCHAR(120)</w:t>
-        <w:br/>
-      </w:r>
-      <w:r>
-        <w:rPr>
-          <w:rFonts w:ascii="Consolas" w:hAnsi="Consolas"/>
-          <w:sz w:val="14"/>
-        </w:rPr>
-        <w:t xml:space="preserve"> validado : BOOLEAN</w:t>
-        <w:br/>
-      </w:r>
-      <w:r>
-        <w:rPr>
-          <w:rFonts w:ascii="Consolas" w:hAnsi="Consolas"/>
-          <w:sz w:val="14"/>
-        </w:rPr>
+        <w:t xml:space="preserve">  id : BIGINT PK</w:t>
+        <w:br/>
+        <w:t xml:space="preserve">  nome : VARCHAR(120)</w:t>
+        <w:br/>
+        <w:t xml:space="preserve">  email : VARCHAR(160) UNIQUE</w:t>
+        <w:br/>
+        <w:t xml:space="preserve">  telefone : VARCHAR(20)</w:t>
+        <w:br/>
+        <w:t xml:space="preserve">  especialidade : VARCHAR(100)</w:t>
+        <w:br/>
+        <w:t xml:space="preserve">  validado : BOOLEAN</w:t>
+        <w:br/>
         <w:t>}</w:t>
         <w:br/>
-      </w:r>
-      <w:r>
-        <w:rPr>
-          <w:rFonts w:ascii="Consolas" w:hAnsi="Consolas"/>
-          <w:sz w:val="14"/>
-        </w:rPr>
+        <w:br/>
         <w:t>entity SERVICO {</w:t>
         <w:br/>
-      </w:r>
-      <w:r>
-        <w:rPr>
-          <w:rFonts w:ascii="Consolas" w:hAnsi="Consolas"/>
-          <w:sz w:val="14"/>
-        </w:rPr>
-        <w:t xml:space="preserve"> * id : BIGINT &lt;&lt;PK&gt;&gt;</w:t>
-        <w:br/>
-      </w:r>
-      <w:r>
-        <w:rPr>
-          <w:rFonts w:ascii="Consolas" w:hAnsi="Consolas"/>
-          <w:sz w:val="14"/>
-        </w:rPr>
-        <w:t xml:space="preserve"> --</w:t>
-        <w:br/>
-      </w:r>
-      <w:r>
-        <w:rPr>
-          <w:rFonts w:ascii="Consolas" w:hAnsi="Consolas"/>
-          <w:sz w:val="14"/>
-        </w:rPr>
-        <w:t xml:space="preserve"> nome : VARCHAR(120)</w:t>
-        <w:br/>
-      </w:r>
-      <w:r>
-        <w:rPr>
-          <w:rFonts w:ascii="Consolas" w:hAnsi="Consolas"/>
-          <w:sz w:val="14"/>
-        </w:rPr>
-        <w:t xml:space="preserve"> descricao : VARCHAR(255)</w:t>
-        <w:br/>
-      </w:r>
-      <w:r>
-        <w:rPr>
-          <w:rFonts w:ascii="Consolas" w:hAnsi="Consolas"/>
-          <w:sz w:val="14"/>
-        </w:rPr>
-        <w:t xml:space="preserve"> preco_base : DECIMAL(12,2)</w:t>
-        <w:br/>
-      </w:r>
-      <w:r>
-        <w:rPr>
-          <w:rFonts w:ascii="Consolas" w:hAnsi="Consolas"/>
-          <w:sz w:val="14"/>
-        </w:rPr>
+        <w:t xml:space="preserve">  codigo : BIGINT PK</w:t>
+        <w:br/>
+        <w:t xml:space="preserve">  nome : VARCHAR(120)</w:t>
+        <w:br/>
+        <w:t xml:space="preserve">  categoria : VARCHAR(80)</w:t>
+        <w:br/>
+        <w:t xml:space="preserve">  preco : DECIMAL(12,2)</w:t>
+        <w:br/>
+        <w:t xml:space="preserve">  ativo : BOOLEAN</w:t>
+        <w:br/>
         <w:t>}</w:t>
         <w:br/>
-      </w:r>
-      <w:r>
-        <w:rPr>
-          <w:rFonts w:ascii="Consolas" w:hAnsi="Consolas"/>
-          <w:sz w:val="14"/>
-        </w:rPr>
+        <w:br/>
         <w:t>entity PEDIDO_SERVICO {</w:t>
         <w:br/>
-      </w:r>
-      <w:r>
-        <w:rPr>
-          <w:rFonts w:ascii="Consolas" w:hAnsi="Consolas"/>
-          <w:sz w:val="14"/>
-        </w:rPr>
-        <w:t xml:space="preserve"> * id : BIGINT &lt;&lt;PK&gt;&gt;</w:t>
-        <w:br/>
-      </w:r>
-      <w:r>
-        <w:rPr>
-          <w:rFonts w:ascii="Consolas" w:hAnsi="Consolas"/>
-          <w:sz w:val="14"/>
-        </w:rPr>
-        <w:t xml:space="preserve"> --</w:t>
-        <w:br/>
-      </w:r>
-      <w:r>
-        <w:rPr>
-          <w:rFonts w:ascii="Consolas" w:hAnsi="Consolas"/>
-          <w:sz w:val="14"/>
-        </w:rPr>
-        <w:t xml:space="preserve"> cliente_id : BIGINT &lt;&lt;FK&gt;&gt;</w:t>
-        <w:br/>
-      </w:r>
-      <w:r>
-        <w:rPr>
-          <w:rFonts w:ascii="Consolas" w:hAnsi="Consolas"/>
-          <w:sz w:val="14"/>
-        </w:rPr>
-        <w:t xml:space="preserve"> profissional_id : BIGINT &lt;&lt;FK&gt;&gt;</w:t>
-        <w:br/>
-      </w:r>
-      <w:r>
-        <w:rPr>
-          <w:rFonts w:ascii="Consolas" w:hAnsi="Consolas"/>
-          <w:sz w:val="14"/>
-        </w:rPr>
-        <w:t xml:space="preserve"> servico_id : BIGINT &lt;&lt;FK&gt;&gt;</w:t>
-        <w:br/>
-      </w:r>
-      <w:r>
-        <w:rPr>
-          <w:rFonts w:ascii="Consolas" w:hAnsi="Consolas"/>
-          <w:sz w:val="14"/>
-        </w:rPr>
-        <w:t xml:space="preserve"> descricao : TEXT</w:t>
-        <w:br/>
-      </w:r>
-      <w:r>
-        <w:rPr>
-          <w:rFonts w:ascii="Consolas" w:hAnsi="Consolas"/>
-          <w:sz w:val="14"/>
-        </w:rPr>
-        <w:t xml:space="preserve"> localidade : VARCHAR(180)</w:t>
-        <w:br/>
-      </w:r>
-      <w:r>
-        <w:rPr>
-          <w:rFonts w:ascii="Consolas" w:hAnsi="Consolas"/>
-          <w:sz w:val="14"/>
-        </w:rPr>
-        <w:t xml:space="preserve"> status : VARCHAR(30)</w:t>
-        <w:br/>
-      </w:r>
-      <w:r>
-        <w:rPr>
-          <w:rFonts w:ascii="Consolas" w:hAnsi="Consolas"/>
-          <w:sz w:val="14"/>
-        </w:rPr>
-        <w:t xml:space="preserve"> data_criacao : DATETIME</w:t>
-        <w:br/>
-      </w:r>
-      <w:r>
-        <w:rPr>
-          <w:rFonts w:ascii="Consolas" w:hAnsi="Consolas"/>
-          <w:sz w:val="14"/>
-        </w:rPr>
+        <w:t xml:space="preserve">  numero : BIGINT PK</w:t>
+        <w:br/>
+        <w:t xml:space="preserve">  data : DATETIME</w:t>
+        <w:br/>
+        <w:t xml:space="preserve">  status : VARCHAR(20)</w:t>
+        <w:br/>
+        <w:t xml:space="preserve">  cliente_id : BIGINT FK</w:t>
+        <w:br/>
+        <w:t xml:space="preserve">  profissional_id : BIGINT FK NULL</w:t>
+        <w:br/>
+        <w:t xml:space="preserve">  localidade : VARCHAR(160)</w:t>
+        <w:br/>
+        <w:t xml:space="preserve">  descricao : VARCHAR(500)</w:t>
+        <w:br/>
         <w:t>}</w:t>
         <w:br/>
-      </w:r>
-      <w:r>
-        <w:rPr>
-          <w:rFonts w:ascii="Consolas" w:hAnsi="Consolas"/>
-          <w:sz w:val="14"/>
-        </w:rPr>
+        <w:br/>
         <w:t>entity ITEM_SERVICO {</w:t>
         <w:br/>
-      </w:r>
-      <w:r>
-        <w:rPr>
-          <w:rFonts w:ascii="Consolas" w:hAnsi="Consolas"/>
-          <w:sz w:val="14"/>
-        </w:rPr>
-        <w:t xml:space="preserve"> * id : BIGINT &lt;&lt;PK&gt;&gt;</w:t>
-        <w:br/>
-      </w:r>
-      <w:r>
-        <w:rPr>
-          <w:rFonts w:ascii="Consolas" w:hAnsi="Consolas"/>
-          <w:sz w:val="14"/>
-        </w:rPr>
-        <w:t xml:space="preserve"> --</w:t>
-        <w:br/>
-      </w:r>
-      <w:r>
-        <w:rPr>
-          <w:rFonts w:ascii="Consolas" w:hAnsi="Consolas"/>
-          <w:sz w:val="14"/>
-        </w:rPr>
-        <w:t xml:space="preserve"> pedido_id : BIGINT &lt;&lt;FK&gt;&gt;</w:t>
-        <w:br/>
-      </w:r>
-      <w:r>
-        <w:rPr>
-          <w:rFonts w:ascii="Consolas" w:hAnsi="Consolas"/>
-          <w:sz w:val="14"/>
-        </w:rPr>
-        <w:t xml:space="preserve"> servico_id : BIGINT &lt;&lt;FK&gt;&gt;</w:t>
-        <w:br/>
-      </w:r>
-      <w:r>
-        <w:rPr>
-          <w:rFonts w:ascii="Consolas" w:hAnsi="Consolas"/>
-          <w:sz w:val="14"/>
-        </w:rPr>
-        <w:t xml:space="preserve"> quantidade : INT</w:t>
-        <w:br/>
-      </w:r>
-      <w:r>
-        <w:rPr>
-          <w:rFonts w:ascii="Consolas" w:hAnsi="Consolas"/>
-          <w:sz w:val="14"/>
-        </w:rPr>
-        <w:t xml:space="preserve"> preco_unitario : DECIMAL(12,2)</w:t>
-        <w:br/>
-      </w:r>
-      <w:r>
-        <w:rPr>
-          <w:rFonts w:ascii="Consolas" w:hAnsi="Consolas"/>
-          <w:sz w:val="14"/>
-        </w:rPr>
+        <w:t xml:space="preserve">  id : BIGINT PK</w:t>
+        <w:br/>
+        <w:t xml:space="preserve">  pedido_id : BIGINT FK</w:t>
+        <w:br/>
+        <w:t xml:space="preserve">  servico_id : BIGINT FK</w:t>
+        <w:br/>
+        <w:t xml:space="preserve">  quantidade : INT</w:t>
+        <w:br/>
+        <w:t xml:space="preserve">  preco_unitario : DECIMAL(12,2)</w:t>
+        <w:br/>
         <w:t>}</w:t>
         <w:br/>
-      </w:r>
-      <w:r>
-        <w:rPr>
-          <w:rFonts w:ascii="Consolas" w:hAnsi="Consolas"/>
-          <w:sz w:val="14"/>
-        </w:rPr>
+        <w:br/>
         <w:t>entity AVALIACAO {</w:t>
         <w:br/>
-      </w:r>
-      <w:r>
-        <w:rPr>
-          <w:rFonts w:ascii="Consolas" w:hAnsi="Consolas"/>
-          <w:sz w:val="14"/>
-        </w:rPr>
-        <w:t xml:space="preserve"> * id : BIGINT &lt;&lt;PK&gt;&gt;</w:t>
-        <w:br/>
-      </w:r>
-      <w:r>
-        <w:rPr>
-          <w:rFonts w:ascii="Consolas" w:hAnsi="Consolas"/>
-          <w:sz w:val="14"/>
-        </w:rPr>
-        <w:t xml:space="preserve"> --</w:t>
-        <w:br/>
-      </w:r>
-      <w:r>
-        <w:rPr>
-          <w:rFonts w:ascii="Consolas" w:hAnsi="Consolas"/>
-          <w:sz w:val="14"/>
-        </w:rPr>
-        <w:t xml:space="preserve"> pedido_id : BIGINT &lt;&lt;FK&gt;&gt;</w:t>
-        <w:br/>
-      </w:r>
-      <w:r>
-        <w:rPr>
-          <w:rFonts w:ascii="Consolas" w:hAnsi="Consolas"/>
-          <w:sz w:val="14"/>
-        </w:rPr>
-        <w:t xml:space="preserve"> profissional_id : BIGINT &lt;&lt;FK&gt;&gt;</w:t>
-        <w:br/>
-      </w:r>
-      <w:r>
-        <w:rPr>
-          <w:rFonts w:ascii="Consolas" w:hAnsi="Consolas"/>
-          <w:sz w:val="14"/>
-        </w:rPr>
-        <w:t xml:space="preserve"> nota : INT [1..5]</w:t>
-        <w:br/>
-      </w:r>
-      <w:r>
-        <w:rPr>
-          <w:rFonts w:ascii="Consolas" w:hAnsi="Consolas"/>
-          <w:sz w:val="14"/>
-        </w:rPr>
-        <w:t xml:space="preserve"> comentario : VARCHAR(500)</w:t>
-        <w:br/>
-      </w:r>
-      <w:r>
-        <w:rPr>
-          <w:rFonts w:ascii="Consolas" w:hAnsi="Consolas"/>
-          <w:sz w:val="14"/>
-        </w:rPr>
-        <w:t xml:space="preserve"> data_criacao : DATETIME</w:t>
-        <w:br/>
-      </w:r>
-      <w:r>
-        <w:rPr>
-          <w:rFonts w:ascii="Consolas" w:hAnsi="Consolas"/>
-          <w:sz w:val="14"/>
-        </w:rPr>
+        <w:t xml:space="preserve">  id : BIGINT PK</w:t>
+        <w:br/>
+        <w:t xml:space="preserve">  pedido_id : BIGINT FK UNIQUE</w:t>
+        <w:br/>
+        <w:t xml:space="preserve">  nota : INT 1..5</w:t>
+        <w:br/>
+        <w:t xml:space="preserve">  comentario : VARCHAR(500) NULL</w:t>
+        <w:br/>
+        <w:t xml:space="preserve">  data : DATETIME</w:t>
+        <w:br/>
         <w:t>}</w:t>
         <w:br/>
-      </w:r>
-      <w:r>
-        <w:rPr>
-          <w:rFonts w:ascii="Consolas" w:hAnsi="Consolas"/>
-          <w:sz w:val="14"/>
-        </w:rPr>
+        <w:br/>
         <w:t>CLIENTE ||--o{ PEDIDO_SERVICO : publica</w:t>
         <w:br/>
-      </w:r>
-      <w:r>
-        <w:rPr>
-          <w:rFonts w:ascii="Consolas" w:hAnsi="Consolas"/>
-          <w:sz w:val="14"/>
-        </w:rPr>
         <w:t>PROFISSIONAL o|--o{ PEDIDO_SERVICO : aceita</w:t>
         <w:br/>
-      </w:r>
-      <w:r>
-        <w:rPr>
-          <w:rFonts w:ascii="Consolas" w:hAnsi="Consolas"/>
-          <w:sz w:val="14"/>
-        </w:rPr>
-        <w:t>SERVICO ||--o{ PEDIDO_SERVICO : categoria</w:t>
-        <w:br/>
-      </w:r>
-      <w:r>
-        <w:rPr>
-          <w:rFonts w:ascii="Consolas" w:hAnsi="Consolas"/>
-          <w:sz w:val="14"/>
-        </w:rPr>
-        <w:t>PEDIDO_SERVICO ||--|{ ITEM_SERVICO : contem</w:t>
-        <w:br/>
-      </w:r>
-      <w:r>
-        <w:rPr>
-          <w:rFonts w:ascii="Consolas" w:hAnsi="Consolas"/>
-          <w:sz w:val="14"/>
-        </w:rPr>
+        <w:t>PEDIDO_SERVICO ||--|{ ITEM_SERVICO : possui</w:t>
+        <w:br/>
         <w:t>SERVICO ||--o{ ITEM_SERVICO : referencia</w:t>
         <w:br/>
-      </w:r>
-      <w:r>
-        <w:rPr>
-          <w:rFonts w:ascii="Consolas" w:hAnsi="Consolas"/>
-          <w:sz w:val="14"/>
-        </w:rPr>
         <w:t>PEDIDO_SERVICO ||--o| AVALIACAO : resulta</w:t>
         <w:br/>
-      </w:r>
-      <w:r>
-        <w:rPr>
-          <w:rFonts w:ascii="Consolas" w:hAnsi="Consolas"/>
-          <w:sz w:val="14"/>
-        </w:rPr>
-        <w:t>PROFISSIONAL ||--o{ AVALIACAO : recebe</w:t>
-        <w:br/>
-      </w:r>
-      <w:r>
-        <w:rPr>
-          <w:rFonts w:ascii="Consolas" w:hAnsi="Consolas"/>
-          <w:sz w:val="14"/>
-        </w:rPr>
+        <w:br/>
         <w:t>@enduml</w:t>
       </w:r>
     </w:p>

</xml_diff>

<commit_message>
docs: ajustar visualizacao do DER
</commit_message>
<xml_diff>
--- a/docs/Marcelo Chaves de Miranda - CONSTRUMOB - revisado.docx
+++ b/docs/Marcelo Chaves de Miranda - CONSTRUMOB - revisado.docx
@@ -19548,6 +19548,11 @@
         <w:t>@startuml</w:t>
         <w:br/>
         <w:t>title DER - CONSTRUMOB MVP</w:t>
+        <w:br/>
+        <w:br/>
+        <w:t>hide circle</w:t>
+        <w:br/>
+        <w:t>skinparam linetype ortho</w:t>
         <w:br/>
         <w:br/>
         <w:t>entity CLIENTE {</w:t>

</xml_diff>

<commit_message>
docs: adicionar prototipos fluxos testes e apendices
</commit_message>
<xml_diff>
--- a/docs/Marcelo Chaves de Miranda - CONSTRUMOB - revisado.docx
+++ b/docs/Marcelo Chaves de Miranda - CONSTRUMOB - revisado.docx
@@ -4295,6 +4295,342 @@
     </w:p>
     <w:p>
       <w:pPr>
+        <w:spacing w:after="0" w:line="240" w:lineRule="auto"/>
+        <w:ind w:left="0"/>
+      </w:pPr>
+      <w:r>
+        <w:rPr>
+          <w:sz w:val="16"/>
+        </w:rPr>
+        <w:t xml:space="preserve">15. Protótipos e interface </w:t>
+      </w:r>
+      <w:r>
+        <w:rPr>
+          <w:sz w:val="16"/>
+        </w:rPr>
+        <w:t>........................................</w:t>
+      </w:r>
+      <w:r>
+        <w:rPr>
+          <w:sz w:val="16"/>
+        </w:rPr>
+        <w:t xml:space="preserve"> 41</w:t>
+      </w:r>
+    </w:p>
+    <w:p>
+      <w:pPr>
+        <w:spacing w:after="0" w:line="240" w:lineRule="auto"/>
+        <w:ind w:left="360"/>
+      </w:pPr>
+      <w:r>
+        <w:rPr>
+          <w:sz w:val="16"/>
+        </w:rPr>
+        <w:t xml:space="preserve">15.1 Princípios de usabilidade e acessibilidade </w:t>
+      </w:r>
+      <w:r>
+        <w:rPr>
+          <w:sz w:val="16"/>
+        </w:rPr>
+        <w:t>...................</w:t>
+      </w:r>
+      <w:r>
+        <w:rPr>
+          <w:sz w:val="16"/>
+        </w:rPr>
+        <w:t xml:space="preserve"> 41</w:t>
+      </w:r>
+    </w:p>
+    <w:p>
+      <w:pPr>
+        <w:spacing w:after="0" w:line="240" w:lineRule="auto"/>
+        <w:ind w:left="360"/>
+      </w:pPr>
+      <w:r>
+        <w:rPr>
+          <w:sz w:val="16"/>
+        </w:rPr>
+        <w:t xml:space="preserve">15.2 Protótipos de tela </w:t>
+      </w:r>
+      <w:r>
+        <w:rPr>
+          <w:sz w:val="16"/>
+        </w:rPr>
+        <w:t>...........................................</w:t>
+      </w:r>
+      <w:r>
+        <w:rPr>
+          <w:sz w:val="16"/>
+        </w:rPr>
+        <w:t xml:space="preserve"> 41</w:t>
+      </w:r>
+    </w:p>
+    <w:p>
+      <w:pPr>
+        <w:spacing w:after="0" w:line="240" w:lineRule="auto"/>
+        <w:ind w:left="360"/>
+      </w:pPr>
+      <w:r>
+        <w:rPr>
+          <w:sz w:val="16"/>
+        </w:rPr>
+        <w:t xml:space="preserve">15.3 Mapa de navegação </w:t>
+      </w:r>
+      <w:r>
+        <w:rPr>
+          <w:sz w:val="16"/>
+        </w:rPr>
+        <w:t>............................................</w:t>
+      </w:r>
+      <w:r>
+        <w:rPr>
+          <w:sz w:val="16"/>
+        </w:rPr>
+        <w:t xml:space="preserve"> 46</w:t>
+      </w:r>
+    </w:p>
+    <w:p>
+      <w:pPr>
+        <w:spacing w:after="0" w:line="240" w:lineRule="auto"/>
+        <w:ind w:left="0"/>
+      </w:pPr>
+      <w:r>
+        <w:rPr>
+          <w:sz w:val="16"/>
+        </w:rPr>
+        <w:t xml:space="preserve">16. Plano e evidências de testes </w:t>
+      </w:r>
+      <w:r>
+        <w:rPr>
+          <w:sz w:val="16"/>
+        </w:rPr>
+        <w:t>..................................</w:t>
+      </w:r>
+      <w:r>
+        <w:rPr>
+          <w:sz w:val="16"/>
+        </w:rPr>
+        <w:t xml:space="preserve"> 48</w:t>
+      </w:r>
+    </w:p>
+    <w:p>
+      <w:pPr>
+        <w:spacing w:after="0" w:line="240" w:lineRule="auto"/>
+        <w:ind w:left="360"/>
+      </w:pPr>
+      <w:r>
+        <w:rPr>
+          <w:sz w:val="16"/>
+        </w:rPr>
+        <w:t xml:space="preserve">16.1 Estratégia de testes </w:t>
+      </w:r>
+      <w:r>
+        <w:rPr>
+          <w:sz w:val="16"/>
+        </w:rPr>
+        <w:t>.........................................</w:t>
+      </w:r>
+      <w:r>
+        <w:rPr>
+          <w:sz w:val="16"/>
+        </w:rPr>
+        <w:t xml:space="preserve"> 48</w:t>
+      </w:r>
+    </w:p>
+    <w:p>
+      <w:pPr>
+        <w:spacing w:after="0" w:line="240" w:lineRule="auto"/>
+        <w:ind w:left="360"/>
+      </w:pPr>
+      <w:r>
+        <w:rPr>
+          <w:sz w:val="16"/>
+        </w:rPr>
+        <w:t xml:space="preserve">16.2 Casos de teste </w:t>
+      </w:r>
+      <w:r>
+        <w:rPr>
+          <w:sz w:val="16"/>
+        </w:rPr>
+        <w:t>...............................................</w:t>
+      </w:r>
+      <w:r>
+        <w:rPr>
+          <w:sz w:val="16"/>
+        </w:rPr>
+        <w:t xml:space="preserve"> 48</w:t>
+      </w:r>
+    </w:p>
+    <w:p>
+      <w:pPr>
+        <w:spacing w:after="0" w:line="240" w:lineRule="auto"/>
+        <w:ind w:left="360"/>
+      </w:pPr>
+      <w:r>
+        <w:rPr>
+          <w:sz w:val="16"/>
+        </w:rPr>
+        <w:t xml:space="preserve">16.3 Registro de defeitos e melhorias </w:t>
+      </w:r>
+      <w:r>
+        <w:rPr>
+          <w:sz w:val="16"/>
+        </w:rPr>
+        <w:t>.............................</w:t>
+      </w:r>
+      <w:r>
+        <w:rPr>
+          <w:sz w:val="16"/>
+        </w:rPr>
+        <w:t xml:space="preserve"> 49</w:t>
+      </w:r>
+    </w:p>
+    <w:p>
+      <w:pPr>
+        <w:spacing w:after="0" w:line="240" w:lineRule="auto"/>
+        <w:ind w:left="0"/>
+      </w:pPr>
+      <w:r>
+        <w:rPr>
+          <w:sz w:val="16"/>
+        </w:rPr>
+        <w:t xml:space="preserve">17. Implementação do MVP </w:t>
+      </w:r>
+      <w:r>
+        <w:rPr>
+          <w:sz w:val="16"/>
+        </w:rPr>
+        <w:t>..........................................</w:t>
+      </w:r>
+      <w:r>
+        <w:rPr>
+          <w:sz w:val="16"/>
+        </w:rPr>
+        <w:t xml:space="preserve"> 50</w:t>
+      </w:r>
+    </w:p>
+    <w:p>
+      <w:pPr>
+        <w:spacing w:after="0" w:line="240" w:lineRule="auto"/>
+        <w:ind w:left="360"/>
+      </w:pPr>
+      <w:r>
+        <w:rPr>
+          <w:sz w:val="16"/>
+        </w:rPr>
+        <w:t xml:space="preserve">17.1 Funcionalidades implementadas </w:t>
+      </w:r>
+      <w:r>
+        <w:rPr>
+          <w:sz w:val="16"/>
+        </w:rPr>
+        <w:t>................................</w:t>
+      </w:r>
+      <w:r>
+        <w:rPr>
+          <w:sz w:val="16"/>
+        </w:rPr>
+        <w:t xml:space="preserve"> 50</w:t>
+      </w:r>
+    </w:p>
+    <w:p>
+      <w:pPr>
+        <w:spacing w:after="0" w:line="240" w:lineRule="auto"/>
+        <w:ind w:left="360"/>
+      </w:pPr>
+      <w:r>
+        <w:rPr>
+          <w:sz w:val="16"/>
+        </w:rPr>
+        <w:t xml:space="preserve">17.2 Demonstração do sistema </w:t>
+      </w:r>
+      <w:r>
+        <w:rPr>
+          <w:sz w:val="16"/>
+        </w:rPr>
+        <w:t>......................................</w:t>
+      </w:r>
+      <w:r>
+        <w:rPr>
+          <w:sz w:val="16"/>
+        </w:rPr>
+        <w:t xml:space="preserve"> 50</w:t>
+      </w:r>
+    </w:p>
+    <w:p>
+      <w:pPr>
+        <w:spacing w:after="0" w:line="240" w:lineRule="auto"/>
+        <w:ind w:left="360"/>
+      </w:pPr>
+      <w:r>
+        <w:rPr>
+          <w:sz w:val="16"/>
+        </w:rPr>
+        <w:t xml:space="preserve">17.3 Contribuição individual </w:t>
+      </w:r>
+      <w:r>
+        <w:rPr>
+          <w:sz w:val="16"/>
+        </w:rPr>
+        <w:t>......................................</w:t>
+      </w:r>
+      <w:r>
+        <w:rPr>
+          <w:sz w:val="16"/>
+        </w:rPr>
+        <w:t xml:space="preserve"> 50</w:t>
+      </w:r>
+    </w:p>
+    <w:p>
+      <w:pPr>
+        <w:spacing w:after="0" w:line="240" w:lineRule="auto"/>
+        <w:ind w:left="0"/>
+      </w:pPr>
+      <w:r>
+        <w:rPr>
+          <w:sz w:val="16"/>
+        </w:rPr>
+        <w:t xml:space="preserve">18. Conclusão e referências </w:t>
+      </w:r>
+      <w:r>
+        <w:rPr>
+          <w:sz w:val="16"/>
+        </w:rPr>
+        <w:t>.......................................</w:t>
+      </w:r>
+      <w:r>
+        <w:rPr>
+          <w:sz w:val="16"/>
+        </w:rPr>
+        <w:t xml:space="preserve"> 52</w:t>
+      </w:r>
+    </w:p>
+    <w:p>
+      <w:pPr>
+        <w:spacing w:after="0" w:line="240" w:lineRule="auto"/>
+        <w:ind w:left="0"/>
+      </w:pPr>
+      <w:r>
+        <w:rPr>
+          <w:sz w:val="16"/>
+        </w:rPr>
+        <w:t xml:space="preserve">Apêndices e anexos </w:t>
+      </w:r>
+      <w:r>
+        <w:rPr>
+          <w:sz w:val="16"/>
+        </w:rPr>
+        <w:t>................................................</w:t>
+      </w:r>
+      <w:r>
+        <w:rPr>
+          <w:sz w:val="16"/>
+        </w:rPr>
+        <w:t xml:space="preserve"> 53</w:t>
+      </w:r>
+    </w:p>
+    <w:p>
+      <w:pPr>
         <w:pStyle w:val="Heading1"/>
         <w:pageBreakBefore/>
       </w:pPr>
@@ -22017,6 +22353,3733 @@
     <w:p>
       <w:r>
         <w:t>Os trechos e caminhos acima foram conferidos contra a estrutura atual do projeto. A documentação não apresenta PaymentFactory, DatabaseConnection, Angular, PHP, Palp-it, disciplinas, tópicos ou áudios como partes do CONSTRUMOB, pois não são componentes comprovados deste MVP.</w:t>
+      </w:r>
+    </w:p>
+    <w:p>
+      <w:r>
+        <w:br w:type="page"/>
+      </w:r>
+    </w:p>
+    <w:p>
+      <w:pPr>
+        <w:pStyle w:val="Heading1"/>
+      </w:pPr>
+      <w:r>
+        <w:t>15. Protótipos e interface</w:t>
+      </w:r>
+    </w:p>
+    <w:p>
+      <w:pPr>
+        <w:pStyle w:val="Heading2"/>
+      </w:pPr>
+      <w:r>
+        <w:t>15.1 Princípios de usabilidade e acessibilidade</w:t>
+      </w:r>
+    </w:p>
+    <w:p>
+      <w:r>
+        <w:t>Os protótipos adotam linguagem visual consistente, navegação previsível e formulários orientados às tarefas do MVP. Cada tela informa seu objetivo, mantém hierarquia visual clara e evita ações de pagamento, que estão fora do escopo.</w:t>
+      </w:r>
+    </w:p>
+    <w:tbl>
+      <w:tblPr>
+        <w:tblW w:type="auto" w:w="0"/>
+        <w:tblLook w:firstColumn="1" w:firstRow="1" w:lastColumn="0" w:lastRow="0" w:noHBand="0" w:noVBand="1" w:val="04A0"/>
+        <w:tblBorders>
+          <w:top w:val="single" w:sz="4" w:color="D9D9D9"/>
+          <w:left w:val="single" w:sz="4" w:color="D9D9D9"/>
+          <w:bottom w:val="single" w:sz="4" w:color="D9D9D9"/>
+          <w:right w:val="single" w:sz="4" w:color="D9D9D9"/>
+          <w:insideH w:val="single" w:sz="4" w:color="D9D9D9"/>
+          <w:insideV w:val="single" w:sz="4" w:color="D9D9D9"/>
+        </w:tblBorders>
+      </w:tblPr>
+      <w:tblGrid>
+        <w:gridCol w:w="3010"/>
+        <w:gridCol w:w="3010"/>
+        <w:gridCol w:w="3010"/>
+      </w:tblGrid>
+      <w:tr>
+        <w:tc>
+          <w:tcPr>
+            <w:tcW w:type="dxa" w:w="3010"/>
+            <w:shd w:fill="1F4E78"/>
+          </w:tcPr>
+          <w:p>
+            <w:r>
+              <w:rPr>
+                <w:b/>
+                <w:color w:val="FFFFFF"/>
+                <w:sz w:val="16"/>
+              </w:rPr>
+              <w:t>Princípio</w:t>
+            </w:r>
+          </w:p>
+        </w:tc>
+        <w:tc>
+          <w:tcPr>
+            <w:tcW w:type="dxa" w:w="3010"/>
+            <w:shd w:fill="1F4E78"/>
+          </w:tcPr>
+          <w:p>
+            <w:r>
+              <w:rPr>
+                <w:b/>
+                <w:color w:val="FFFFFF"/>
+                <w:sz w:val="16"/>
+              </w:rPr>
+              <w:t>Aplicação no protótipo</w:t>
+            </w:r>
+          </w:p>
+        </w:tc>
+        <w:tc>
+          <w:tcPr>
+            <w:tcW w:type="dxa" w:w="3010"/>
+            <w:shd w:fill="1F4E78"/>
+          </w:tcPr>
+          <w:p>
+            <w:r>
+              <w:rPr>
+                <w:b/>
+                <w:color w:val="FFFFFF"/>
+                <w:sz w:val="16"/>
+              </w:rPr>
+              <w:t>Verificação</w:t>
+            </w:r>
+          </w:p>
+        </w:tc>
+      </w:tr>
+      <w:tr>
+        <w:tc>
+          <w:tcPr>
+            <w:tcW w:type="dxa" w:w="3010"/>
+            <w:vAlign w:val="center"/>
+          </w:tcPr>
+          <w:p>
+            <w:r>
+              <w:rPr>
+                <w:sz w:val="16"/>
+              </w:rPr>
+              <w:t>Visibilidade do estado</w:t>
+            </w:r>
+          </w:p>
+        </w:tc>
+        <w:tc>
+          <w:tcPr>
+            <w:tcW w:type="dxa" w:w="3010"/>
+            <w:vAlign w:val="center"/>
+          </w:tcPr>
+          <w:p>
+            <w:r>
+              <w:rPr>
+                <w:sz w:val="16"/>
+              </w:rPr>
+              <w:t>Status ABERTO, ACEITO e FINALIZADO aparecem no contexto da demanda.</w:t>
+            </w:r>
+          </w:p>
+        </w:tc>
+        <w:tc>
+          <w:tcPr>
+            <w:tcW w:type="dxa" w:w="3010"/>
+            <w:vAlign w:val="center"/>
+          </w:tcPr>
+          <w:p>
+            <w:r>
+              <w:rPr>
+                <w:sz w:val="16"/>
+              </w:rPr>
+              <w:t>Conferir telas 03, 04 e 05.</w:t>
+            </w:r>
+          </w:p>
+        </w:tc>
+      </w:tr>
+      <w:tr>
+        <w:tc>
+          <w:tcPr>
+            <w:tcW w:type="dxa" w:w="3010"/>
+            <w:vAlign w:val="center"/>
+            <w:shd w:fill="F2F6FA"/>
+          </w:tcPr>
+          <w:p>
+            <w:r>
+              <w:rPr>
+                <w:sz w:val="16"/>
+              </w:rPr>
+              <w:t>Consistência</w:t>
+            </w:r>
+          </w:p>
+        </w:tc>
+        <w:tc>
+          <w:tcPr>
+            <w:tcW w:type="dxa" w:w="3010"/>
+            <w:vAlign w:val="center"/>
+            <w:shd w:fill="F2F6FA"/>
+          </w:tcPr>
+          <w:p>
+            <w:r>
+              <w:rPr>
+                <w:sz w:val="16"/>
+              </w:rPr>
+              <w:t>Cabeçalho CONSTRUMOB, menu e botões reutilizam o mesmo padrão.</w:t>
+            </w:r>
+          </w:p>
+        </w:tc>
+        <w:tc>
+          <w:tcPr>
+            <w:tcW w:type="dxa" w:w="3010"/>
+            <w:vAlign w:val="center"/>
+            <w:shd w:fill="F2F6FA"/>
+          </w:tcPr>
+          <w:p>
+            <w:r>
+              <w:rPr>
+                <w:sz w:val="16"/>
+              </w:rPr>
+              <w:t>Comparar os seis HTML.</w:t>
+            </w:r>
+          </w:p>
+        </w:tc>
+      </w:tr>
+      <w:tr>
+        <w:tc>
+          <w:tcPr>
+            <w:tcW w:type="dxa" w:w="3010"/>
+            <w:vAlign w:val="center"/>
+          </w:tcPr>
+          <w:p>
+            <w:r>
+              <w:rPr>
+                <w:sz w:val="16"/>
+              </w:rPr>
+              <w:t>Prevenção de erros</w:t>
+            </w:r>
+          </w:p>
+        </w:tc>
+        <w:tc>
+          <w:tcPr>
+            <w:tcW w:type="dxa" w:w="3010"/>
+            <w:vAlign w:val="center"/>
+          </w:tcPr>
+          <w:p>
+            <w:r>
+              <w:rPr>
+                <w:sz w:val="16"/>
+              </w:rPr>
+              <w:t>Campos obrigatórios são apresentados antes da ação principal.</w:t>
+            </w:r>
+          </w:p>
+        </w:tc>
+        <w:tc>
+          <w:tcPr>
+            <w:tcW w:type="dxa" w:w="3010"/>
+            <w:vAlign w:val="center"/>
+          </w:tcPr>
+          <w:p>
+            <w:r>
+              <w:rPr>
+                <w:sz w:val="16"/>
+              </w:rPr>
+              <w:t>Executar formulários sem preencher.</w:t>
+            </w:r>
+          </w:p>
+        </w:tc>
+      </w:tr>
+      <w:tr>
+        <w:tc>
+          <w:tcPr>
+            <w:tcW w:type="dxa" w:w="3010"/>
+            <w:vAlign w:val="center"/>
+            <w:shd w:fill="F2F6FA"/>
+          </w:tcPr>
+          <w:p>
+            <w:r>
+              <w:rPr>
+                <w:sz w:val="16"/>
+              </w:rPr>
+              <w:t>Acessibilidade</w:t>
+            </w:r>
+          </w:p>
+        </w:tc>
+        <w:tc>
+          <w:tcPr>
+            <w:tcW w:type="dxa" w:w="3010"/>
+            <w:vAlign w:val="center"/>
+            <w:shd w:fill="F2F6FA"/>
+          </w:tcPr>
+          <w:p>
+            <w:r>
+              <w:rPr>
+                <w:sz w:val="16"/>
+              </w:rPr>
+              <w:t>Contraste, textos objetivos, áreas clicáveis e estrutura sem dependência exclusiva de cor.</w:t>
+            </w:r>
+          </w:p>
+        </w:tc>
+        <w:tc>
+          <w:tcPr>
+            <w:tcW w:type="dxa" w:w="3010"/>
+            <w:vAlign w:val="center"/>
+            <w:shd w:fill="F2F6FA"/>
+          </w:tcPr>
+          <w:p>
+            <w:r>
+              <w:rPr>
+                <w:sz w:val="16"/>
+              </w:rPr>
+              <w:t>Revisão manual e teste de teclado.</w:t>
+            </w:r>
+          </w:p>
+        </w:tc>
+      </w:tr>
+      <w:tr>
+        <w:tc>
+          <w:tcPr>
+            <w:tcW w:type="dxa" w:w="3010"/>
+            <w:vAlign w:val="center"/>
+          </w:tcPr>
+          <w:p>
+            <w:r>
+              <w:rPr>
+                <w:sz w:val="16"/>
+              </w:rPr>
+              <w:t>Rastreabilidade</w:t>
+            </w:r>
+          </w:p>
+        </w:tc>
+        <w:tc>
+          <w:tcPr>
+            <w:tcW w:type="dxa" w:w="3010"/>
+            <w:vAlign w:val="center"/>
+          </w:tcPr>
+          <w:p>
+            <w:r>
+              <w:rPr>
+                <w:sz w:val="16"/>
+              </w:rPr>
+              <w:t>Cada protótipo aponta para um ou mais casos de uso corrigidos.</w:t>
+            </w:r>
+          </w:p>
+        </w:tc>
+        <w:tc>
+          <w:tcPr>
+            <w:tcW w:type="dxa" w:w="3010"/>
+            <w:vAlign w:val="center"/>
+          </w:tcPr>
+          <w:p>
+            <w:r>
+              <w:rPr>
+                <w:sz w:val="16"/>
+              </w:rPr>
+              <w:t>Tabela 15.2 e links diretos abaixo.</w:t>
+            </w:r>
+          </w:p>
+        </w:tc>
+      </w:tr>
+    </w:tbl>
+    <w:p/>
+    <w:p>
+      <w:pPr>
+        <w:pStyle w:val="Heading2"/>
+      </w:pPr>
+      <w:r>
+        <w:t>15.2 Protótipos de tela</w:t>
+      </w:r>
+    </w:p>
+    <w:p>
+      <w:r>
+        <w:t>As imagens abaixo são prévias estáticas dos protótipos HTML. Os links apontam diretamente para os arquivos versionados no branch codex/prototipos e podem ser abertos no navegador.</w:t>
+      </w:r>
+    </w:p>
+    <w:tbl>
+      <w:tblPr>
+        <w:tblW w:type="auto" w:w="0"/>
+        <w:tblLook w:firstColumn="1" w:firstRow="1" w:lastColumn="0" w:lastRow="0" w:noHBand="0" w:noVBand="1" w:val="04A0"/>
+        <w:tblBorders>
+          <w:top w:val="single" w:sz="4" w:color="D9D9D9"/>
+          <w:left w:val="single" w:sz="4" w:color="D9D9D9"/>
+          <w:bottom w:val="single" w:sz="4" w:color="D9D9D9"/>
+          <w:right w:val="single" w:sz="4" w:color="D9D9D9"/>
+          <w:insideH w:val="single" w:sz="4" w:color="D9D9D9"/>
+          <w:insideV w:val="single" w:sz="4" w:color="D9D9D9"/>
+        </w:tblBorders>
+      </w:tblPr>
+      <w:tblGrid>
+        <w:gridCol w:w="2257"/>
+        <w:gridCol w:w="2257"/>
+        <w:gridCol w:w="2257"/>
+        <w:gridCol w:w="2257"/>
+      </w:tblGrid>
+      <w:tr>
+        <w:tc>
+          <w:tcPr>
+            <w:tcW w:type="dxa" w:w="2257"/>
+            <w:shd w:fill="1F4E78"/>
+          </w:tcPr>
+          <w:p>
+            <w:r>
+              <w:rPr>
+                <w:b/>
+                <w:color w:val="FFFFFF"/>
+                <w:sz w:val="16"/>
+              </w:rPr>
+              <w:t>Tela</w:t>
+            </w:r>
+          </w:p>
+        </w:tc>
+        <w:tc>
+          <w:tcPr>
+            <w:tcW w:type="dxa" w:w="2257"/>
+            <w:shd w:fill="1F4E78"/>
+          </w:tcPr>
+          <w:p>
+            <w:r>
+              <w:rPr>
+                <w:b/>
+                <w:color w:val="FFFFFF"/>
+                <w:sz w:val="16"/>
+              </w:rPr>
+              <w:t>Rastreabilidade</w:t>
+            </w:r>
+          </w:p>
+        </w:tc>
+        <w:tc>
+          <w:tcPr>
+            <w:tcW w:type="dxa" w:w="2257"/>
+            <w:shd w:fill="1F4E78"/>
+          </w:tcPr>
+          <w:p>
+            <w:r>
+              <w:rPr>
+                <w:b/>
+                <w:color w:val="FFFFFF"/>
+                <w:sz w:val="16"/>
+              </w:rPr>
+              <w:t>Arquivo HTML</w:t>
+            </w:r>
+          </w:p>
+        </w:tc>
+        <w:tc>
+          <w:tcPr>
+            <w:tcW w:type="dxa" w:w="2257"/>
+            <w:shd w:fill="1F4E78"/>
+          </w:tcPr>
+          <w:p>
+            <w:r>
+              <w:rPr>
+                <w:b/>
+                <w:color w:val="FFFFFF"/>
+                <w:sz w:val="16"/>
+              </w:rPr>
+              <w:t>Imagem</w:t>
+            </w:r>
+          </w:p>
+        </w:tc>
+      </w:tr>
+      <w:tr>
+        <w:tc>
+          <w:tcPr>
+            <w:tcW w:type="dxa" w:w="2257"/>
+            <w:vAlign w:val="center"/>
+          </w:tcPr>
+          <w:p>
+            <w:r>
+              <w:rPr>
+                <w:sz w:val="16"/>
+              </w:rPr>
+              <w:t>Tela de acesso</w:t>
+            </w:r>
+          </w:p>
+        </w:tc>
+        <w:tc>
+          <w:tcPr>
+            <w:tcW w:type="dxa" w:w="2257"/>
+            <w:vAlign w:val="center"/>
+          </w:tcPr>
+          <w:p>
+            <w:r>
+              <w:rPr>
+                <w:sz w:val="16"/>
+              </w:rPr>
+              <w:t>UC-01</w:t>
+            </w:r>
+          </w:p>
+        </w:tc>
+        <w:tc>
+          <w:tcPr>
+            <w:tcW w:type="dxa" w:w="2257"/>
+            <w:vAlign w:val="center"/>
+          </w:tcPr>
+          <w:p>
+            <w:r>
+              <w:rPr>
+                <w:sz w:val="16"/>
+              </w:rPr>
+              <w:t>https://github.com/GPSMiranda/CONSTRUMOB-SISTEMA-DE-UBERIZA-O-PARA-SERVI-OS-DE-CONSTRU-O-CIVIL/blob/codex/prototipos/docs/prototypes/01-acesso.html</w:t>
+            </w:r>
+          </w:p>
+        </w:tc>
+        <w:tc>
+          <w:tcPr>
+            <w:tcW w:type="dxa" w:w="2257"/>
+            <w:vAlign w:val="center"/>
+          </w:tcPr>
+          <w:p>
+            <w:r>
+              <w:rPr>
+                <w:sz w:val="16"/>
+              </w:rPr>
+              <w:t>https://github.com/GPSMiranda/CONSTRUMOB-SISTEMA-DE-UBERIZA-O-PARA-SERVI-OS-DE-CONSTRU-O-CIVIL/blob/codex/prototipos/docs/prototypes/images/01-acesso.png</w:t>
+            </w:r>
+          </w:p>
+        </w:tc>
+      </w:tr>
+      <w:tr>
+        <w:tc>
+          <w:tcPr>
+            <w:tcW w:type="dxa" w:w="2257"/>
+            <w:vAlign w:val="center"/>
+            <w:shd w:fill="F2F6FA"/>
+          </w:tcPr>
+          <w:p>
+            <w:r>
+              <w:rPr>
+                <w:sz w:val="16"/>
+              </w:rPr>
+              <w:t>Cadastro de usuário</w:t>
+            </w:r>
+          </w:p>
+        </w:tc>
+        <w:tc>
+          <w:tcPr>
+            <w:tcW w:type="dxa" w:w="2257"/>
+            <w:vAlign w:val="center"/>
+            <w:shd w:fill="F2F6FA"/>
+          </w:tcPr>
+          <w:p>
+            <w:r>
+              <w:rPr>
+                <w:sz w:val="16"/>
+              </w:rPr>
+              <w:t>UC-01</w:t>
+            </w:r>
+          </w:p>
+        </w:tc>
+        <w:tc>
+          <w:tcPr>
+            <w:tcW w:type="dxa" w:w="2257"/>
+            <w:vAlign w:val="center"/>
+            <w:shd w:fill="F2F6FA"/>
+          </w:tcPr>
+          <w:p>
+            <w:r>
+              <w:rPr>
+                <w:sz w:val="16"/>
+              </w:rPr>
+              <w:t>https://github.com/GPSMiranda/CONSTRUMOB-SISTEMA-DE-UBERIZA-O-PARA-SERVI-OS-DE-CONSTRU-O-CIVIL/blob/codex/prototipos/docs/prototypes/02-cadastro.html</w:t>
+            </w:r>
+          </w:p>
+        </w:tc>
+        <w:tc>
+          <w:tcPr>
+            <w:tcW w:type="dxa" w:w="2257"/>
+            <w:vAlign w:val="center"/>
+            <w:shd w:fill="F2F6FA"/>
+          </w:tcPr>
+          <w:p>
+            <w:r>
+              <w:rPr>
+                <w:sz w:val="16"/>
+              </w:rPr>
+              <w:t>https://github.com/GPSMiranda/CONSTRUMOB-SISTEMA-DE-UBERIZA-O-PARA-SERVI-OS-DE-CONSTRU-O-CIVIL/blob/codex/prototipos/docs/prototypes/images/02-cadastro.png</w:t>
+            </w:r>
+          </w:p>
+        </w:tc>
+      </w:tr>
+      <w:tr>
+        <w:tc>
+          <w:tcPr>
+            <w:tcW w:type="dxa" w:w="2257"/>
+            <w:vAlign w:val="center"/>
+          </w:tcPr>
+          <w:p>
+            <w:r>
+              <w:rPr>
+                <w:sz w:val="16"/>
+              </w:rPr>
+              <w:t>Publicar demanda</w:t>
+            </w:r>
+          </w:p>
+        </w:tc>
+        <w:tc>
+          <w:tcPr>
+            <w:tcW w:type="dxa" w:w="2257"/>
+            <w:vAlign w:val="center"/>
+          </w:tcPr>
+          <w:p>
+            <w:r>
+              <w:rPr>
+                <w:sz w:val="16"/>
+              </w:rPr>
+              <w:t>UC-02</w:t>
+            </w:r>
+          </w:p>
+        </w:tc>
+        <w:tc>
+          <w:tcPr>
+            <w:tcW w:type="dxa" w:w="2257"/>
+            <w:vAlign w:val="center"/>
+          </w:tcPr>
+          <w:p>
+            <w:r>
+              <w:rPr>
+                <w:sz w:val="16"/>
+              </w:rPr>
+              <w:t>https://github.com/GPSMiranda/CONSTRUMOB-SISTEMA-DE-UBERIZA-O-PARA-SERVI-OS-DE-CONSTRU-O-CIVIL/blob/codex/prototipos/docs/prototypes/03-publicar-demanda.html</w:t>
+            </w:r>
+          </w:p>
+        </w:tc>
+        <w:tc>
+          <w:tcPr>
+            <w:tcW w:type="dxa" w:w="2257"/>
+            <w:vAlign w:val="center"/>
+          </w:tcPr>
+          <w:p>
+            <w:r>
+              <w:rPr>
+                <w:sz w:val="16"/>
+              </w:rPr>
+              <w:t>https://github.com/GPSMiranda/CONSTRUMOB-SISTEMA-DE-UBERIZA-O-PARA-SERVI-OS-DE-CONSTRU-O-CIVIL/blob/codex/prototipos/docs/prototypes/images/03-publicar-demanda.png</w:t>
+            </w:r>
+          </w:p>
+        </w:tc>
+      </w:tr>
+      <w:tr>
+        <w:tc>
+          <w:tcPr>
+            <w:tcW w:type="dxa" w:w="2257"/>
+            <w:vAlign w:val="center"/>
+            <w:shd w:fill="F2F6FA"/>
+          </w:tcPr>
+          <w:p>
+            <w:r>
+              <w:rPr>
+                <w:sz w:val="16"/>
+              </w:rPr>
+              <w:t>Consultar e aceitar demanda</w:t>
+            </w:r>
+          </w:p>
+        </w:tc>
+        <w:tc>
+          <w:tcPr>
+            <w:tcW w:type="dxa" w:w="2257"/>
+            <w:vAlign w:val="center"/>
+            <w:shd w:fill="F2F6FA"/>
+          </w:tcPr>
+          <w:p>
+            <w:r>
+              <w:rPr>
+                <w:sz w:val="16"/>
+              </w:rPr>
+              <w:t>UC-03 / UC-04</w:t>
+            </w:r>
+          </w:p>
+        </w:tc>
+        <w:tc>
+          <w:tcPr>
+            <w:tcW w:type="dxa" w:w="2257"/>
+            <w:vAlign w:val="center"/>
+            <w:shd w:fill="F2F6FA"/>
+          </w:tcPr>
+          <w:p>
+            <w:r>
+              <w:rPr>
+                <w:sz w:val="16"/>
+              </w:rPr>
+              <w:t>https://github.com/GPSMiranda/CONSTRUMOB-SISTEMA-DE-UBERIZA-O-PARA-SERVI-OS-DE-CONSTRU-O-CIVIL/blob/codex/prototipos/docs/prototypes/04-consultar-demandas.html</w:t>
+            </w:r>
+          </w:p>
+        </w:tc>
+        <w:tc>
+          <w:tcPr>
+            <w:tcW w:type="dxa" w:w="2257"/>
+            <w:vAlign w:val="center"/>
+            <w:shd w:fill="F2F6FA"/>
+          </w:tcPr>
+          <w:p>
+            <w:r>
+              <w:rPr>
+                <w:sz w:val="16"/>
+              </w:rPr>
+              <w:t>https://github.com/GPSMiranda/CONSTRUMOB-SISTEMA-DE-UBERIZA-O-PARA-SERVI-OS-DE-CONSTRU-O-CIVIL/blob/codex/prototipos/docs/prototypes/images/04-consultar-demandas.png</w:t>
+            </w:r>
+          </w:p>
+        </w:tc>
+      </w:tr>
+      <w:tr>
+        <w:tc>
+          <w:tcPr>
+            <w:tcW w:type="dxa" w:w="2257"/>
+            <w:vAlign w:val="center"/>
+          </w:tcPr>
+          <w:p>
+            <w:r>
+              <w:rPr>
+                <w:sz w:val="16"/>
+              </w:rPr>
+              <w:t>Finalizar serviço</w:t>
+            </w:r>
+          </w:p>
+        </w:tc>
+        <w:tc>
+          <w:tcPr>
+            <w:tcW w:type="dxa" w:w="2257"/>
+            <w:vAlign w:val="center"/>
+          </w:tcPr>
+          <w:p>
+            <w:r>
+              <w:rPr>
+                <w:sz w:val="16"/>
+              </w:rPr>
+              <w:t>UC-05</w:t>
+            </w:r>
+          </w:p>
+        </w:tc>
+        <w:tc>
+          <w:tcPr>
+            <w:tcW w:type="dxa" w:w="2257"/>
+            <w:vAlign w:val="center"/>
+          </w:tcPr>
+          <w:p>
+            <w:r>
+              <w:rPr>
+                <w:sz w:val="16"/>
+              </w:rPr>
+              <w:t>https://github.com/GPSMiranda/CONSTRUMOB-SISTEMA-DE-UBERIZA-O-PARA-SERVI-OS-DE-CONSTRU-O-CIVIL/blob/codex/prototipos/docs/prototypes/05-finalizar-servico.html</w:t>
+            </w:r>
+          </w:p>
+        </w:tc>
+        <w:tc>
+          <w:tcPr>
+            <w:tcW w:type="dxa" w:w="2257"/>
+            <w:vAlign w:val="center"/>
+          </w:tcPr>
+          <w:p>
+            <w:r>
+              <w:rPr>
+                <w:sz w:val="16"/>
+              </w:rPr>
+              <w:t>https://github.com/GPSMiranda/CONSTRUMOB-SISTEMA-DE-UBERIZA-O-PARA-SERVI-OS-DE-CONSTRU-O-CIVIL/blob/codex/prototipos/docs/prototypes/images/05-finalizar-servico.png</w:t>
+            </w:r>
+          </w:p>
+        </w:tc>
+      </w:tr>
+      <w:tr>
+        <w:tc>
+          <w:tcPr>
+            <w:tcW w:type="dxa" w:w="2257"/>
+            <w:vAlign w:val="center"/>
+            <w:shd w:fill="F2F6FA"/>
+          </w:tcPr>
+          <w:p>
+            <w:r>
+              <w:rPr>
+                <w:sz w:val="16"/>
+              </w:rPr>
+              <w:t>Avaliar e moderar</w:t>
+            </w:r>
+          </w:p>
+        </w:tc>
+        <w:tc>
+          <w:tcPr>
+            <w:tcW w:type="dxa" w:w="2257"/>
+            <w:vAlign w:val="center"/>
+            <w:shd w:fill="F2F6FA"/>
+          </w:tcPr>
+          <w:p>
+            <w:r>
+              <w:rPr>
+                <w:sz w:val="16"/>
+              </w:rPr>
+              <w:t>UC-06 / UC-07</w:t>
+            </w:r>
+          </w:p>
+        </w:tc>
+        <w:tc>
+          <w:tcPr>
+            <w:tcW w:type="dxa" w:w="2257"/>
+            <w:vAlign w:val="center"/>
+            <w:shd w:fill="F2F6FA"/>
+          </w:tcPr>
+          <w:p>
+            <w:r>
+              <w:rPr>
+                <w:sz w:val="16"/>
+              </w:rPr>
+              <w:t>https://github.com/GPSMiranda/CONSTRUMOB-SISTEMA-DE-UBERIZA-O-PARA-SERVI-OS-DE-CONSTRU-O-CIVIL/blob/codex/prototipos/docs/prototypes/06-avaliar-moderar.html</w:t>
+            </w:r>
+          </w:p>
+        </w:tc>
+        <w:tc>
+          <w:tcPr>
+            <w:tcW w:type="dxa" w:w="2257"/>
+            <w:vAlign w:val="center"/>
+            <w:shd w:fill="F2F6FA"/>
+          </w:tcPr>
+          <w:p>
+            <w:r>
+              <w:rPr>
+                <w:sz w:val="16"/>
+              </w:rPr>
+              <w:t>https://github.com/GPSMiranda/CONSTRUMOB-SISTEMA-DE-UBERIZA-O-PARA-SERVI-OS-DE-CONSTRU-O-CIVIL/blob/codex/prototipos/docs/prototypes/images/06-avaliar-moderar.png</w:t>
+            </w:r>
+          </w:p>
+        </w:tc>
+      </w:tr>
+    </w:tbl>
+    <w:p/>
+    <w:p>
+      <w:pPr>
+        <w:pStyle w:val="Heading3"/>
+      </w:pPr>
+      <w:r>
+        <w:t>Tela de acesso — UC-01</w:t>
+      </w:r>
+    </w:p>
+    <w:p>
+      <w:r>
+        <w:drawing>
+          <wp:inline>
+            <wp:extent cx="5212080" cy="3300984"/>
+            <wp:docPr id="16" name="Picture 16"/>
+            <wp:cNvGraphicFramePr>
+              <a:graphicFrameLocks noChangeAspect="1"/>
+            </wp:cNvGraphicFramePr>
+            <a:graphic>
+              <a:graphicData uri="http://schemas.openxmlformats.org/drawingml/2006/picture">
+                <pic:pic>
+                  <pic:nvPicPr>
+                    <pic:cNvPr id="0" name="01-acesso.png"/>
+                    <pic:cNvPicPr/>
+                  </pic:nvPicPr>
+                  <pic:blipFill>
+                    <a:blip r:embed="rId71"/>
+                    <a:stretch>
+                      <a:fillRect/>
+                    </a:stretch>
+                  </pic:blipFill>
+                  <pic:spPr>
+                    <a:xfrm>
+                      <a:off x="0" y="0"/>
+                      <a:ext cx="5212080" cy="3300984"/>
+                    </a:xfrm>
+                    <a:prstGeom prst="rect"/>
+                  </pic:spPr>
+                </pic:pic>
+              </a:graphicData>
+            </a:graphic>
+          </wp:inline>
+        </w:drawing>
+      </w:r>
+    </w:p>
+    <w:p>
+      <w:r>
+        <w:t xml:space="preserve">Abrir protótipo: </w:t>
+      </w:r>
+      <w:hyperlink r:id="rId72">
+        <w:r>
+          <w:rPr>
+            <w:color w:val="0563C1"/>
+            <w:u w:val="single"/>
+          </w:rPr>
+          <w:t>https://github.com/GPSMiranda/CONSTRUMOB-SISTEMA-DE-UBERIZA-O-PARA-SERVI-OS-DE-CONSTRU-O-CIVIL/blob/codex/prototipos/docs/prototypes/01-acesso.html</w:t>
+        </w:r>
+      </w:hyperlink>
+      <w:r>
+        <w:t xml:space="preserve"> | Abrir imagem: </w:t>
+      </w:r>
+      <w:hyperlink r:id="rId73">
+        <w:r>
+          <w:rPr>
+            <w:color w:val="0563C1"/>
+            <w:u w:val="single"/>
+          </w:rPr>
+          <w:t>https://github.com/GPSMiranda/CONSTRUMOB-SISTEMA-DE-UBERIZA-O-PARA-SERVI-OS-DE-CONSTRU-O-CIVIL/blob/codex/prototipos/docs/prototypes/images/01-acesso.png</w:t>
+        </w:r>
+      </w:hyperlink>
+    </w:p>
+    <w:p>
+      <w:pPr>
+        <w:pStyle w:val="Heading3"/>
+      </w:pPr>
+      <w:r>
+        <w:t>Cadastro de usuário — UC-01</w:t>
+      </w:r>
+    </w:p>
+    <w:p>
+      <w:r>
+        <w:drawing>
+          <wp:inline>
+            <wp:extent cx="5212080" cy="3300984"/>
+            <wp:docPr id="17" name="Picture 17"/>
+            <wp:cNvGraphicFramePr>
+              <a:graphicFrameLocks noChangeAspect="1"/>
+            </wp:cNvGraphicFramePr>
+            <a:graphic>
+              <a:graphicData uri="http://schemas.openxmlformats.org/drawingml/2006/picture">
+                <pic:pic>
+                  <pic:nvPicPr>
+                    <pic:cNvPr id="0" name="02-cadastro.png"/>
+                    <pic:cNvPicPr/>
+                  </pic:nvPicPr>
+                  <pic:blipFill>
+                    <a:blip r:embed="rId74"/>
+                    <a:stretch>
+                      <a:fillRect/>
+                    </a:stretch>
+                  </pic:blipFill>
+                  <pic:spPr>
+                    <a:xfrm>
+                      <a:off x="0" y="0"/>
+                      <a:ext cx="5212080" cy="3300984"/>
+                    </a:xfrm>
+                    <a:prstGeom prst="rect"/>
+                  </pic:spPr>
+                </pic:pic>
+              </a:graphicData>
+            </a:graphic>
+          </wp:inline>
+        </w:drawing>
+      </w:r>
+    </w:p>
+    <w:p>
+      <w:r>
+        <w:t xml:space="preserve">Abrir protótipo: </w:t>
+      </w:r>
+      <w:hyperlink r:id="rId75">
+        <w:r>
+          <w:rPr>
+            <w:color w:val="0563C1"/>
+            <w:u w:val="single"/>
+          </w:rPr>
+          <w:t>https://github.com/GPSMiranda/CONSTRUMOB-SISTEMA-DE-UBERIZA-O-PARA-SERVI-OS-DE-CONSTRU-O-CIVIL/blob/codex/prototipos/docs/prototypes/02-cadastro.html</w:t>
+        </w:r>
+      </w:hyperlink>
+      <w:r>
+        <w:t xml:space="preserve"> | Abrir imagem: </w:t>
+      </w:r>
+      <w:hyperlink r:id="rId76">
+        <w:r>
+          <w:rPr>
+            <w:color w:val="0563C1"/>
+            <w:u w:val="single"/>
+          </w:rPr>
+          <w:t>https://github.com/GPSMiranda/CONSTRUMOB-SISTEMA-DE-UBERIZA-O-PARA-SERVI-OS-DE-CONSTRU-O-CIVIL/blob/codex/prototipos/docs/prototypes/images/02-cadastro.png</w:t>
+        </w:r>
+      </w:hyperlink>
+    </w:p>
+    <w:p>
+      <w:pPr>
+        <w:pStyle w:val="Heading3"/>
+      </w:pPr>
+      <w:r>
+        <w:t>Publicar demanda — UC-02</w:t>
+      </w:r>
+    </w:p>
+    <w:p>
+      <w:r>
+        <w:drawing>
+          <wp:inline>
+            <wp:extent cx="5212080" cy="3300984"/>
+            <wp:docPr id="18" name="Picture 18"/>
+            <wp:cNvGraphicFramePr>
+              <a:graphicFrameLocks noChangeAspect="1"/>
+            </wp:cNvGraphicFramePr>
+            <a:graphic>
+              <a:graphicData uri="http://schemas.openxmlformats.org/drawingml/2006/picture">
+                <pic:pic>
+                  <pic:nvPicPr>
+                    <pic:cNvPr id="0" name="03-publicar-demanda.png"/>
+                    <pic:cNvPicPr/>
+                  </pic:nvPicPr>
+                  <pic:blipFill>
+                    <a:blip r:embed="rId77"/>
+                    <a:stretch>
+                      <a:fillRect/>
+                    </a:stretch>
+                  </pic:blipFill>
+                  <pic:spPr>
+                    <a:xfrm>
+                      <a:off x="0" y="0"/>
+                      <a:ext cx="5212080" cy="3300984"/>
+                    </a:xfrm>
+                    <a:prstGeom prst="rect"/>
+                  </pic:spPr>
+                </pic:pic>
+              </a:graphicData>
+            </a:graphic>
+          </wp:inline>
+        </w:drawing>
+      </w:r>
+    </w:p>
+    <w:p>
+      <w:r>
+        <w:t xml:space="preserve">Abrir protótipo: </w:t>
+      </w:r>
+      <w:hyperlink r:id="rId78">
+        <w:r>
+          <w:rPr>
+            <w:color w:val="0563C1"/>
+            <w:u w:val="single"/>
+          </w:rPr>
+          <w:t>https://github.com/GPSMiranda/CONSTRUMOB-SISTEMA-DE-UBERIZA-O-PARA-SERVI-OS-DE-CONSTRU-O-CIVIL/blob/codex/prototipos/docs/prototypes/03-publicar-demanda.html</w:t>
+        </w:r>
+      </w:hyperlink>
+      <w:r>
+        <w:t xml:space="preserve"> | Abrir imagem: </w:t>
+      </w:r>
+      <w:hyperlink r:id="rId79">
+        <w:r>
+          <w:rPr>
+            <w:color w:val="0563C1"/>
+            <w:u w:val="single"/>
+          </w:rPr>
+          <w:t>https://github.com/GPSMiranda/CONSTRUMOB-SISTEMA-DE-UBERIZA-O-PARA-SERVI-OS-DE-CONSTRU-O-CIVIL/blob/codex/prototipos/docs/prototypes/images/03-publicar-demanda.png</w:t>
+        </w:r>
+      </w:hyperlink>
+    </w:p>
+    <w:p>
+      <w:pPr>
+        <w:pStyle w:val="Heading3"/>
+      </w:pPr>
+      <w:r>
+        <w:t>Consultar e aceitar demanda — UC-03 / UC-04</w:t>
+      </w:r>
+    </w:p>
+    <w:p>
+      <w:r>
+        <w:drawing>
+          <wp:inline>
+            <wp:extent cx="5212080" cy="3300984"/>
+            <wp:docPr id="19" name="Picture 19"/>
+            <wp:cNvGraphicFramePr>
+              <a:graphicFrameLocks noChangeAspect="1"/>
+            </wp:cNvGraphicFramePr>
+            <a:graphic>
+              <a:graphicData uri="http://schemas.openxmlformats.org/drawingml/2006/picture">
+                <pic:pic>
+                  <pic:nvPicPr>
+                    <pic:cNvPr id="0" name="04-consultar-demandas.png"/>
+                    <pic:cNvPicPr/>
+                  </pic:nvPicPr>
+                  <pic:blipFill>
+                    <a:blip r:embed="rId80"/>
+                    <a:stretch>
+                      <a:fillRect/>
+                    </a:stretch>
+                  </pic:blipFill>
+                  <pic:spPr>
+                    <a:xfrm>
+                      <a:off x="0" y="0"/>
+                      <a:ext cx="5212080" cy="3300984"/>
+                    </a:xfrm>
+                    <a:prstGeom prst="rect"/>
+                  </pic:spPr>
+                </pic:pic>
+              </a:graphicData>
+            </a:graphic>
+          </wp:inline>
+        </w:drawing>
+      </w:r>
+    </w:p>
+    <w:p>
+      <w:r>
+        <w:t xml:space="preserve">Abrir protótipo: </w:t>
+      </w:r>
+      <w:hyperlink r:id="rId81">
+        <w:r>
+          <w:rPr>
+            <w:color w:val="0563C1"/>
+            <w:u w:val="single"/>
+          </w:rPr>
+          <w:t>https://github.com/GPSMiranda/CONSTRUMOB-SISTEMA-DE-UBERIZA-O-PARA-SERVI-OS-DE-CONSTRU-O-CIVIL/blob/codex/prototipos/docs/prototypes/04-consultar-demandas.html</w:t>
+        </w:r>
+      </w:hyperlink>
+      <w:r>
+        <w:t xml:space="preserve"> | Abrir imagem: </w:t>
+      </w:r>
+      <w:hyperlink r:id="rId82">
+        <w:r>
+          <w:rPr>
+            <w:color w:val="0563C1"/>
+            <w:u w:val="single"/>
+          </w:rPr>
+          <w:t>https://github.com/GPSMiranda/CONSTRUMOB-SISTEMA-DE-UBERIZA-O-PARA-SERVI-OS-DE-CONSTRU-O-CIVIL/blob/codex/prototipos/docs/prototypes/images/04-consultar-demandas.png</w:t>
+        </w:r>
+      </w:hyperlink>
+    </w:p>
+    <w:p>
+      <w:pPr>
+        <w:pStyle w:val="Heading3"/>
+      </w:pPr>
+      <w:r>
+        <w:t>Finalizar serviço — UC-05</w:t>
+      </w:r>
+    </w:p>
+    <w:p>
+      <w:r>
+        <w:drawing>
+          <wp:inline>
+            <wp:extent cx="5212080" cy="3300984"/>
+            <wp:docPr id="20" name="Picture 20"/>
+            <wp:cNvGraphicFramePr>
+              <a:graphicFrameLocks noChangeAspect="1"/>
+            </wp:cNvGraphicFramePr>
+            <a:graphic>
+              <a:graphicData uri="http://schemas.openxmlformats.org/drawingml/2006/picture">
+                <pic:pic>
+                  <pic:nvPicPr>
+                    <pic:cNvPr id="0" name="05-finalizar-servico.png"/>
+                    <pic:cNvPicPr/>
+                  </pic:nvPicPr>
+                  <pic:blipFill>
+                    <a:blip r:embed="rId83"/>
+                    <a:stretch>
+                      <a:fillRect/>
+                    </a:stretch>
+                  </pic:blipFill>
+                  <pic:spPr>
+                    <a:xfrm>
+                      <a:off x="0" y="0"/>
+                      <a:ext cx="5212080" cy="3300984"/>
+                    </a:xfrm>
+                    <a:prstGeom prst="rect"/>
+                  </pic:spPr>
+                </pic:pic>
+              </a:graphicData>
+            </a:graphic>
+          </wp:inline>
+        </w:drawing>
+      </w:r>
+    </w:p>
+    <w:p>
+      <w:r>
+        <w:t xml:space="preserve">Abrir protótipo: </w:t>
+      </w:r>
+      <w:hyperlink r:id="rId84">
+        <w:r>
+          <w:rPr>
+            <w:color w:val="0563C1"/>
+            <w:u w:val="single"/>
+          </w:rPr>
+          <w:t>https://github.com/GPSMiranda/CONSTRUMOB-SISTEMA-DE-UBERIZA-O-PARA-SERVI-OS-DE-CONSTRU-O-CIVIL/blob/codex/prototipos/docs/prototypes/05-finalizar-servico.html</w:t>
+        </w:r>
+      </w:hyperlink>
+      <w:r>
+        <w:t xml:space="preserve"> | Abrir imagem: </w:t>
+      </w:r>
+      <w:hyperlink r:id="rId85">
+        <w:r>
+          <w:rPr>
+            <w:color w:val="0563C1"/>
+            <w:u w:val="single"/>
+          </w:rPr>
+          <w:t>https://github.com/GPSMiranda/CONSTRUMOB-SISTEMA-DE-UBERIZA-O-PARA-SERVI-OS-DE-CONSTRU-O-CIVIL/blob/codex/prototipos/docs/prototypes/images/05-finalizar-servico.png</w:t>
+        </w:r>
+      </w:hyperlink>
+    </w:p>
+    <w:p>
+      <w:pPr>
+        <w:pStyle w:val="Heading3"/>
+      </w:pPr>
+      <w:r>
+        <w:t>Avaliar e moderar — UC-06 / UC-07</w:t>
+      </w:r>
+    </w:p>
+    <w:p>
+      <w:r>
+        <w:drawing>
+          <wp:inline>
+            <wp:extent cx="5212080" cy="3300984"/>
+            <wp:docPr id="21" name="Picture 21"/>
+            <wp:cNvGraphicFramePr>
+              <a:graphicFrameLocks noChangeAspect="1"/>
+            </wp:cNvGraphicFramePr>
+            <a:graphic>
+              <a:graphicData uri="http://schemas.openxmlformats.org/drawingml/2006/picture">
+                <pic:pic>
+                  <pic:nvPicPr>
+                    <pic:cNvPr id="0" name="06-avaliar-moderar.png"/>
+                    <pic:cNvPicPr/>
+                  </pic:nvPicPr>
+                  <pic:blipFill>
+                    <a:blip r:embed="rId86"/>
+                    <a:stretch>
+                      <a:fillRect/>
+                    </a:stretch>
+                  </pic:blipFill>
+                  <pic:spPr>
+                    <a:xfrm>
+                      <a:off x="0" y="0"/>
+                      <a:ext cx="5212080" cy="3300984"/>
+                    </a:xfrm>
+                    <a:prstGeom prst="rect"/>
+                  </pic:spPr>
+                </pic:pic>
+              </a:graphicData>
+            </a:graphic>
+          </wp:inline>
+        </w:drawing>
+      </w:r>
+    </w:p>
+    <w:p>
+      <w:r>
+        <w:t xml:space="preserve">Abrir protótipo: </w:t>
+      </w:r>
+      <w:hyperlink r:id="rId87">
+        <w:r>
+          <w:rPr>
+            <w:color w:val="0563C1"/>
+            <w:u w:val="single"/>
+          </w:rPr>
+          <w:t>https://github.com/GPSMiranda/CONSTRUMOB-SISTEMA-DE-UBERIZA-O-PARA-SERVI-OS-DE-CONSTRU-O-CIVIL/blob/codex/prototipos/docs/prototypes/06-avaliar-moderar.html</w:t>
+        </w:r>
+      </w:hyperlink>
+      <w:r>
+        <w:t xml:space="preserve"> | Abrir imagem: </w:t>
+      </w:r>
+      <w:hyperlink r:id="rId88">
+        <w:r>
+          <w:rPr>
+            <w:color w:val="0563C1"/>
+            <w:u w:val="single"/>
+          </w:rPr>
+          <w:t>https://github.com/GPSMiranda/CONSTRUMOB-SISTEMA-DE-UBERIZA-O-PARA-SERVI-OS-DE-CONSTRU-O-CIVIL/blob/codex/prototipos/docs/prototypes/images/06-avaliar-moderar.png</w:t>
+        </w:r>
+      </w:hyperlink>
+    </w:p>
+    <w:p>
+      <w:pPr>
+        <w:pStyle w:val="Heading2"/>
+      </w:pPr>
+      <w:r>
+        <w:t>15.3 Mapa de navegação</w:t>
+      </w:r>
+    </w:p>
+    <w:p>
+      <w:r>
+        <w:t>Os mapas substituem a descrição textual isolada por fluxos visuais correspondentes aos perfis e casos de uso corrigidos. As imagens e o código PlantUML estão versionados no repositório.</w:t>
+      </w:r>
+    </w:p>
+    <w:p>
+      <w:pPr>
+        <w:pStyle w:val="Heading3"/>
+      </w:pPr>
+      <w:r>
+        <w:t>Fluxo do Cliente</w:t>
+      </w:r>
+    </w:p>
+    <w:p>
+      <w:r>
+        <w:drawing>
+          <wp:inline>
+            <wp:extent cx="5577840" cy="1784909"/>
+            <wp:docPr id="22" name="Picture 22"/>
+            <wp:cNvGraphicFramePr>
+              <a:graphicFrameLocks noChangeAspect="1"/>
+            </wp:cNvGraphicFramePr>
+            <a:graphic>
+              <a:graphicData uri="http://schemas.openxmlformats.org/drawingml/2006/picture">
+                <pic:pic>
+                  <pic:nvPicPr>
+                    <pic:cNvPr id="0" name="fluxo-cliente.png"/>
+                    <pic:cNvPicPr/>
+                  </pic:nvPicPr>
+                  <pic:blipFill>
+                    <a:blip r:embed="rId89"/>
+                    <a:stretch>
+                      <a:fillRect/>
+                    </a:stretch>
+                  </pic:blipFill>
+                  <pic:spPr>
+                    <a:xfrm>
+                      <a:off x="0" y="0"/>
+                      <a:ext cx="5577840" cy="1784909"/>
+                    </a:xfrm>
+                    <a:prstGeom prst="rect"/>
+                  </pic:spPr>
+                </pic:pic>
+              </a:graphicData>
+            </a:graphic>
+          </wp:inline>
+        </w:drawing>
+      </w:r>
+    </w:p>
+    <w:p>
+      <w:r>
+        <w:t xml:space="preserve">Imagem: </w:t>
+      </w:r>
+      <w:hyperlink r:id="rId90">
+        <w:r>
+          <w:rPr>
+            <w:color w:val="0563C1"/>
+            <w:u w:val="single"/>
+          </w:rPr>
+          <w:t>https://github.com/GPSMiranda/CONSTRUMOB-SISTEMA-DE-UBERIZA-O-PARA-SERVI-OS-DE-CONSTRU-O-CIVIL/blob/codex/prototipos/docs/prototypes/images/fluxo-cliente.png</w:t>
+        </w:r>
+      </w:hyperlink>
+      <w:r>
+        <w:t xml:space="preserve"> | Código: </w:t>
+      </w:r>
+      <w:hyperlink r:id="rId91">
+        <w:r>
+          <w:rPr>
+            <w:color w:val="0563C1"/>
+            <w:u w:val="single"/>
+          </w:rPr>
+          <w:t>https://github.com/GPSMiranda/CONSTRUMOB-SISTEMA-DE-UBERIZA-O-PARA-SERVI-OS-DE-CONSTRU-O-CIVIL/blob/codex/prototipos/docs/prototypes/15.3-mapas-navegacao.puml</w:t>
+        </w:r>
+      </w:hyperlink>
+      <w:r>
+        <w:t xml:space="preserve"> | Casos: UC-01, UC-02, UC-05, UC-06</w:t>
+      </w:r>
+    </w:p>
+    <w:p>
+      <w:pPr>
+        <w:pStyle w:val="Heading3"/>
+      </w:pPr>
+      <w:r>
+        <w:t>Fluxo do Profissional</w:t>
+      </w:r>
+    </w:p>
+    <w:p>
+      <w:r>
+        <w:drawing>
+          <wp:inline>
+            <wp:extent cx="5577840" cy="1784909"/>
+            <wp:docPr id="23" name="Picture 23"/>
+            <wp:cNvGraphicFramePr>
+              <a:graphicFrameLocks noChangeAspect="1"/>
+            </wp:cNvGraphicFramePr>
+            <a:graphic>
+              <a:graphicData uri="http://schemas.openxmlformats.org/drawingml/2006/picture">
+                <pic:pic>
+                  <pic:nvPicPr>
+                    <pic:cNvPr id="0" name="fluxo-profissional.png"/>
+                    <pic:cNvPicPr/>
+                  </pic:nvPicPr>
+                  <pic:blipFill>
+                    <a:blip r:embed="rId92"/>
+                    <a:stretch>
+                      <a:fillRect/>
+                    </a:stretch>
+                  </pic:blipFill>
+                  <pic:spPr>
+                    <a:xfrm>
+                      <a:off x="0" y="0"/>
+                      <a:ext cx="5577840" cy="1784909"/>
+                    </a:xfrm>
+                    <a:prstGeom prst="rect"/>
+                  </pic:spPr>
+                </pic:pic>
+              </a:graphicData>
+            </a:graphic>
+          </wp:inline>
+        </w:drawing>
+      </w:r>
+    </w:p>
+    <w:p>
+      <w:r>
+        <w:t xml:space="preserve">Imagem: </w:t>
+      </w:r>
+      <w:hyperlink r:id="rId93">
+        <w:r>
+          <w:rPr>
+            <w:color w:val="0563C1"/>
+            <w:u w:val="single"/>
+          </w:rPr>
+          <w:t>https://github.com/GPSMiranda/CONSTRUMOB-SISTEMA-DE-UBERIZA-O-PARA-SERVI-OS-DE-CONSTRU-O-CIVIL/blob/codex/prototipos/docs/prototypes/images/fluxo-profissional.png</w:t>
+        </w:r>
+      </w:hyperlink>
+      <w:r>
+        <w:t xml:space="preserve"> | Código: </w:t>
+      </w:r>
+      <w:hyperlink r:id="rId91">
+        <w:r>
+          <w:rPr>
+            <w:color w:val="0563C1"/>
+            <w:u w:val="single"/>
+          </w:rPr>
+          <w:t>https://github.com/GPSMiranda/CONSTRUMOB-SISTEMA-DE-UBERIZA-O-PARA-SERVI-OS-DE-CONSTRU-O-CIVIL/blob/codex/prototipos/docs/prototypes/15.3-mapas-navegacao.puml</w:t>
+        </w:r>
+      </w:hyperlink>
+      <w:r>
+        <w:t xml:space="preserve"> | Casos: UC-01, UC-03, UC-04, UC-05</w:t>
+      </w:r>
+    </w:p>
+    <w:p>
+      <w:pPr>
+        <w:pStyle w:val="Heading3"/>
+      </w:pPr>
+      <w:r>
+        <w:t>Fluxo do Administrador</w:t>
+      </w:r>
+    </w:p>
+    <w:p>
+      <w:r>
+        <w:drawing>
+          <wp:inline>
+            <wp:extent cx="5577840" cy="1784909"/>
+            <wp:docPr id="24" name="Picture 24"/>
+            <wp:cNvGraphicFramePr>
+              <a:graphicFrameLocks noChangeAspect="1"/>
+            </wp:cNvGraphicFramePr>
+            <a:graphic>
+              <a:graphicData uri="http://schemas.openxmlformats.org/drawingml/2006/picture">
+                <pic:pic>
+                  <pic:nvPicPr>
+                    <pic:cNvPr id="0" name="fluxo-administrador.png"/>
+                    <pic:cNvPicPr/>
+                  </pic:nvPicPr>
+                  <pic:blipFill>
+                    <a:blip r:embed="rId94"/>
+                    <a:stretch>
+                      <a:fillRect/>
+                    </a:stretch>
+                  </pic:blipFill>
+                  <pic:spPr>
+                    <a:xfrm>
+                      <a:off x="0" y="0"/>
+                      <a:ext cx="5577840" cy="1784909"/>
+                    </a:xfrm>
+                    <a:prstGeom prst="rect"/>
+                  </pic:spPr>
+                </pic:pic>
+              </a:graphicData>
+            </a:graphic>
+          </wp:inline>
+        </w:drawing>
+      </w:r>
+    </w:p>
+    <w:p>
+      <w:r>
+        <w:t xml:space="preserve">Imagem: </w:t>
+      </w:r>
+      <w:hyperlink r:id="rId95">
+        <w:r>
+          <w:rPr>
+            <w:color w:val="0563C1"/>
+            <w:u w:val="single"/>
+          </w:rPr>
+          <w:t>https://github.com/GPSMiranda/CONSTRUMOB-SISTEMA-DE-UBERIZA-O-PARA-SERVI-OS-DE-CONSTRU-O-CIVIL/blob/codex/prototipos/docs/prototypes/images/fluxo-administrador.png</w:t>
+        </w:r>
+      </w:hyperlink>
+      <w:r>
+        <w:t xml:space="preserve"> | Código: </w:t>
+      </w:r>
+      <w:hyperlink r:id="rId91">
+        <w:r>
+          <w:rPr>
+            <w:color w:val="0563C1"/>
+            <w:u w:val="single"/>
+          </w:rPr>
+          <w:t>https://github.com/GPSMiranda/CONSTRUMOB-SISTEMA-DE-UBERIZA-O-PARA-SERVI-OS-DE-CONSTRU-O-CIVIL/blob/codex/prototipos/docs/prototypes/15.3-mapas-navegacao.puml</w:t>
+        </w:r>
+      </w:hyperlink>
+      <w:r>
+        <w:t xml:space="preserve"> | Casos: UC-01, UC-07</w:t>
+      </w:r>
+    </w:p>
+    <w:p>
+      <w:r>
+        <w:br w:type="page"/>
+      </w:r>
+    </w:p>
+    <w:p>
+      <w:pPr>
+        <w:pStyle w:val="Heading1"/>
+      </w:pPr>
+      <w:r>
+        <w:t>16. Plano e evidências de testes</w:t>
+      </w:r>
+    </w:p>
+    <w:p>
+      <w:pPr>
+        <w:pStyle w:val="Heading2"/>
+      </w:pPr>
+      <w:r>
+        <w:t>16.1 Estratégia de testes</w:t>
+      </w:r>
+    </w:p>
+    <w:p>
+      <w:r>
+        <w:t>A estratégia combina testes funcionais dos casos de uso, verificação dos fluxos críticos, validação das regras de negócio e inspeção de usabilidade. Cada teste deve registrar dados de entrada, resultado esperado, resultado observado e evidência versionada.</w:t>
+      </w:r>
+    </w:p>
+    <w:tbl>
+      <w:tblPr>
+        <w:tblW w:type="auto" w:w="0"/>
+        <w:tblLook w:firstColumn="1" w:firstRow="1" w:lastColumn="0" w:lastRow="0" w:noHBand="0" w:noVBand="1" w:val="04A0"/>
+        <w:tblBorders>
+          <w:top w:val="single" w:sz="4" w:color="D9D9D9"/>
+          <w:left w:val="single" w:sz="4" w:color="D9D9D9"/>
+          <w:bottom w:val="single" w:sz="4" w:color="D9D9D9"/>
+          <w:right w:val="single" w:sz="4" w:color="D9D9D9"/>
+          <w:insideH w:val="single" w:sz="4" w:color="D9D9D9"/>
+          <w:insideV w:val="single" w:sz="4" w:color="D9D9D9"/>
+        </w:tblBorders>
+      </w:tblPr>
+      <w:tblGrid>
+        <w:gridCol w:w="3010"/>
+        <w:gridCol w:w="3010"/>
+        <w:gridCol w:w="3010"/>
+      </w:tblGrid>
+      <w:tr>
+        <w:tc>
+          <w:tcPr>
+            <w:tcW w:type="dxa" w:w="3010"/>
+            <w:shd w:fill="1F4E78"/>
+          </w:tcPr>
+          <w:p>
+            <w:r>
+              <w:rPr>
+                <w:b/>
+                <w:color w:val="FFFFFF"/>
+                <w:sz w:val="16"/>
+              </w:rPr>
+              <w:t>Tipo</w:t>
+            </w:r>
+          </w:p>
+        </w:tc>
+        <w:tc>
+          <w:tcPr>
+            <w:tcW w:type="dxa" w:w="3010"/>
+            <w:shd w:fill="1F4E78"/>
+          </w:tcPr>
+          <w:p>
+            <w:r>
+              <w:rPr>
+                <w:b/>
+                <w:color w:val="FFFFFF"/>
+                <w:sz w:val="16"/>
+              </w:rPr>
+              <w:t>Escopo</w:t>
+            </w:r>
+          </w:p>
+        </w:tc>
+        <w:tc>
+          <w:tcPr>
+            <w:tcW w:type="dxa" w:w="3010"/>
+            <w:shd w:fill="1F4E78"/>
+          </w:tcPr>
+          <w:p>
+            <w:r>
+              <w:rPr>
+                <w:b/>
+                <w:color w:val="FFFFFF"/>
+                <w:sz w:val="16"/>
+              </w:rPr>
+              <w:t>Evidência</w:t>
+            </w:r>
+          </w:p>
+        </w:tc>
+      </w:tr>
+      <w:tr>
+        <w:tc>
+          <w:tcPr>
+            <w:tcW w:type="dxa" w:w="3010"/>
+            <w:vAlign w:val="center"/>
+          </w:tcPr>
+          <w:p>
+            <w:r>
+              <w:rPr>
+                <w:sz w:val="16"/>
+              </w:rPr>
+              <w:t>Funcional</w:t>
+            </w:r>
+          </w:p>
+        </w:tc>
+        <w:tc>
+          <w:tcPr>
+            <w:tcW w:type="dxa" w:w="3010"/>
+            <w:vAlign w:val="center"/>
+          </w:tcPr>
+          <w:p>
+            <w:r>
+              <w:rPr>
+                <w:sz w:val="16"/>
+              </w:rPr>
+              <w:t>UC-01 a UC-07, incluindo estados e permissões.</w:t>
+            </w:r>
+          </w:p>
+        </w:tc>
+        <w:tc>
+          <w:tcPr>
+            <w:tcW w:type="dxa" w:w="3010"/>
+            <w:vAlign w:val="center"/>
+          </w:tcPr>
+          <w:p>
+            <w:r>
+              <w:rPr>
+                <w:sz w:val="16"/>
+              </w:rPr>
+              <w:t>Casos de teste da Tabela 16.2.</w:t>
+            </w:r>
+          </w:p>
+        </w:tc>
+      </w:tr>
+      <w:tr>
+        <w:tc>
+          <w:tcPr>
+            <w:tcW w:type="dxa" w:w="3010"/>
+            <w:vAlign w:val="center"/>
+            <w:shd w:fill="F2F6FA"/>
+          </w:tcPr>
+          <w:p>
+            <w:r>
+              <w:rPr>
+                <w:sz w:val="16"/>
+              </w:rPr>
+              <w:t>Integração</w:t>
+            </w:r>
+          </w:p>
+        </w:tc>
+        <w:tc>
+          <w:tcPr>
+            <w:tcW w:type="dxa" w:w="3010"/>
+            <w:vAlign w:val="center"/>
+            <w:shd w:fill="F2F6FA"/>
+          </w:tcPr>
+          <w:p>
+            <w:r>
+              <w:rPr>
+                <w:sz w:val="16"/>
+              </w:rPr>
+              <w:t>Controllers, Services, Repositories e MySQL.</w:t>
+            </w:r>
+          </w:p>
+        </w:tc>
+        <w:tc>
+          <w:tcPr>
+            <w:tcW w:type="dxa" w:w="3010"/>
+            <w:vAlign w:val="center"/>
+            <w:shd w:fill="F2F6FA"/>
+          </w:tcPr>
+          <w:p>
+            <w:r>
+              <w:rPr>
+                <w:sz w:val="16"/>
+              </w:rPr>
+              <w:t>src/main/java e database/schema.sql.</w:t>
+            </w:r>
+          </w:p>
+        </w:tc>
+      </w:tr>
+      <w:tr>
+        <w:tc>
+          <w:tcPr>
+            <w:tcW w:type="dxa" w:w="3010"/>
+            <w:vAlign w:val="center"/>
+          </w:tcPr>
+          <w:p>
+            <w:r>
+              <w:rPr>
+                <w:sz w:val="16"/>
+              </w:rPr>
+              <w:t>Usabilidade</w:t>
+            </w:r>
+          </w:p>
+        </w:tc>
+        <w:tc>
+          <w:tcPr>
+            <w:tcW w:type="dxa" w:w="3010"/>
+            <w:vAlign w:val="center"/>
+          </w:tcPr>
+          <w:p>
+            <w:r>
+              <w:rPr>
+                <w:sz w:val="16"/>
+              </w:rPr>
+              <w:t>Navegação, mensagens, contraste e formulários.</w:t>
+            </w:r>
+          </w:p>
+        </w:tc>
+        <w:tc>
+          <w:tcPr>
+            <w:tcW w:type="dxa" w:w="3010"/>
+            <w:vAlign w:val="center"/>
+          </w:tcPr>
+          <w:p>
+            <w:r>
+              <w:rPr>
+                <w:sz w:val="16"/>
+              </w:rPr>
+              <w:t>Imagens em docs/prototypes/images.</w:t>
+            </w:r>
+          </w:p>
+        </w:tc>
+      </w:tr>
+      <w:tr>
+        <w:tc>
+          <w:tcPr>
+            <w:tcW w:type="dxa" w:w="3010"/>
+            <w:vAlign w:val="center"/>
+            <w:shd w:fill="F2F6FA"/>
+          </w:tcPr>
+          <w:p>
+            <w:r>
+              <w:rPr>
+                <w:sz w:val="16"/>
+              </w:rPr>
+              <w:t>Regressão</w:t>
+            </w:r>
+          </w:p>
+        </w:tc>
+        <w:tc>
+          <w:tcPr>
+            <w:tcW w:type="dxa" w:w="3010"/>
+            <w:vAlign w:val="center"/>
+            <w:shd w:fill="F2F6FA"/>
+          </w:tcPr>
+          <w:p>
+            <w:r>
+              <w:rPr>
+                <w:sz w:val="16"/>
+              </w:rPr>
+              <w:t>Ausência de pagamentos e artefatos de outro projeto.</w:t>
+            </w:r>
+          </w:p>
+        </w:tc>
+        <w:tc>
+          <w:tcPr>
+            <w:tcW w:type="dxa" w:w="3010"/>
+            <w:vAlign w:val="center"/>
+            <w:shd w:fill="F2F6FA"/>
+          </w:tcPr>
+          <w:p>
+            <w:r>
+              <w:rPr>
+                <w:sz w:val="16"/>
+              </w:rPr>
+              <w:t>Commit 6cd46f9 e revisão UML.</w:t>
+            </w:r>
+          </w:p>
+        </w:tc>
+      </w:tr>
+    </w:tbl>
+    <w:p/>
+    <w:p>
+      <w:pPr>
+        <w:pStyle w:val="Heading2"/>
+      </w:pPr>
+      <w:r>
+        <w:t>16.2 Casos de teste</w:t>
+      </w:r>
+    </w:p>
+    <w:tbl>
+      <w:tblPr>
+        <w:tblW w:type="auto" w:w="0"/>
+        <w:tblLook w:firstColumn="1" w:firstRow="1" w:lastColumn="0" w:lastRow="0" w:noHBand="0" w:noVBand="1" w:val="04A0"/>
+        <w:tblBorders>
+          <w:top w:val="single" w:sz="4" w:color="D9D9D9"/>
+          <w:left w:val="single" w:sz="4" w:color="D9D9D9"/>
+          <w:bottom w:val="single" w:sz="4" w:color="D9D9D9"/>
+          <w:right w:val="single" w:sz="4" w:color="D9D9D9"/>
+          <w:insideH w:val="single" w:sz="4" w:color="D9D9D9"/>
+          <w:insideV w:val="single" w:sz="4" w:color="D9D9D9"/>
+        </w:tblBorders>
+      </w:tblPr>
+      <w:tblGrid>
+        <w:gridCol w:w="1806"/>
+        <w:gridCol w:w="1806"/>
+        <w:gridCol w:w="1806"/>
+        <w:gridCol w:w="1806"/>
+        <w:gridCol w:w="1806"/>
+      </w:tblGrid>
+      <w:tr>
+        <w:tc>
+          <w:tcPr>
+            <w:tcW w:type="dxa" w:w="1806"/>
+            <w:shd w:fill="1F4E78"/>
+          </w:tcPr>
+          <w:p>
+            <w:r>
+              <w:rPr>
+                <w:b/>
+                <w:color w:val="FFFFFF"/>
+                <w:sz w:val="16"/>
+              </w:rPr>
+              <w:t>ID</w:t>
+            </w:r>
+          </w:p>
+        </w:tc>
+        <w:tc>
+          <w:tcPr>
+            <w:tcW w:type="dxa" w:w="1806"/>
+            <w:shd w:fill="1F4E78"/>
+          </w:tcPr>
+          <w:p>
+            <w:r>
+              <w:rPr>
+                <w:b/>
+                <w:color w:val="FFFFFF"/>
+                <w:sz w:val="16"/>
+              </w:rPr>
+              <w:t>Caso</w:t>
+            </w:r>
+          </w:p>
+        </w:tc>
+        <w:tc>
+          <w:tcPr>
+            <w:tcW w:type="dxa" w:w="1806"/>
+            <w:shd w:fill="1F4E78"/>
+          </w:tcPr>
+          <w:p>
+            <w:r>
+              <w:rPr>
+                <w:b/>
+                <w:color w:val="FFFFFF"/>
+                <w:sz w:val="16"/>
+              </w:rPr>
+              <w:t>Pré-condição</w:t>
+            </w:r>
+          </w:p>
+        </w:tc>
+        <w:tc>
+          <w:tcPr>
+            <w:tcW w:type="dxa" w:w="1806"/>
+            <w:shd w:fill="1F4E78"/>
+          </w:tcPr>
+          <w:p>
+            <w:r>
+              <w:rPr>
+                <w:b/>
+                <w:color w:val="FFFFFF"/>
+                <w:sz w:val="16"/>
+              </w:rPr>
+              <w:t>Resultado esperado</w:t>
+            </w:r>
+          </w:p>
+        </w:tc>
+        <w:tc>
+          <w:tcPr>
+            <w:tcW w:type="dxa" w:w="1806"/>
+            <w:shd w:fill="1F4E78"/>
+          </w:tcPr>
+          <w:p>
+            <w:r>
+              <w:rPr>
+                <w:b/>
+                <w:color w:val="FFFFFF"/>
+                <w:sz w:val="16"/>
+              </w:rPr>
+              <w:t>Evidência</w:t>
+            </w:r>
+          </w:p>
+        </w:tc>
+      </w:tr>
+      <w:tr>
+        <w:tc>
+          <w:tcPr>
+            <w:tcW w:type="dxa" w:w="1806"/>
+            <w:vAlign w:val="center"/>
+          </w:tcPr>
+          <w:p>
+            <w:r>
+              <w:rPr>
+                <w:sz w:val="16"/>
+              </w:rPr>
+              <w:t>CT-01</w:t>
+            </w:r>
+          </w:p>
+        </w:tc>
+        <w:tc>
+          <w:tcPr>
+            <w:tcW w:type="dxa" w:w="1806"/>
+            <w:vAlign w:val="center"/>
+          </w:tcPr>
+          <w:p>
+            <w:r>
+              <w:rPr>
+                <w:sz w:val="16"/>
+              </w:rPr>
+              <w:t>Cadastrar/autenticar</w:t>
+            </w:r>
+          </w:p>
+        </w:tc>
+        <w:tc>
+          <w:tcPr>
+            <w:tcW w:type="dxa" w:w="1806"/>
+            <w:vAlign w:val="center"/>
+          </w:tcPr>
+          <w:p>
+            <w:r>
+              <w:rPr>
+                <w:sz w:val="16"/>
+              </w:rPr>
+              <w:t>Dados válidos ou e-mail duplicado.</w:t>
+            </w:r>
+          </w:p>
+        </w:tc>
+        <w:tc>
+          <w:tcPr>
+            <w:tcW w:type="dxa" w:w="1806"/>
+            <w:vAlign w:val="center"/>
+          </w:tcPr>
+          <w:p>
+            <w:r>
+              <w:rPr>
+                <w:sz w:val="16"/>
+              </w:rPr>
+              <w:t>Conta criada ou erro de duplicidade sem sessão inválida.</w:t>
+            </w:r>
+          </w:p>
+        </w:tc>
+        <w:tc>
+          <w:tcPr>
+            <w:tcW w:type="dxa" w:w="1806"/>
+            <w:vAlign w:val="center"/>
+          </w:tcPr>
+          <w:p>
+            <w:r>
+              <w:rPr>
+                <w:sz w:val="16"/>
+              </w:rPr>
+              <w:t>UC-01; docs/prototypes/01-acesso.html.</w:t>
+            </w:r>
+          </w:p>
+        </w:tc>
+      </w:tr>
+      <w:tr>
+        <w:tc>
+          <w:tcPr>
+            <w:tcW w:type="dxa" w:w="1806"/>
+            <w:vAlign w:val="center"/>
+            <w:shd w:fill="F2F6FA"/>
+          </w:tcPr>
+          <w:p>
+            <w:r>
+              <w:rPr>
+                <w:sz w:val="16"/>
+              </w:rPr>
+              <w:t>CT-02</w:t>
+            </w:r>
+          </w:p>
+        </w:tc>
+        <w:tc>
+          <w:tcPr>
+            <w:tcW w:type="dxa" w:w="1806"/>
+            <w:vAlign w:val="center"/>
+            <w:shd w:fill="F2F6FA"/>
+          </w:tcPr>
+          <w:p>
+            <w:r>
+              <w:rPr>
+                <w:sz w:val="16"/>
+              </w:rPr>
+              <w:t>Publicar demanda</w:t>
+            </w:r>
+          </w:p>
+        </w:tc>
+        <w:tc>
+          <w:tcPr>
+            <w:tcW w:type="dxa" w:w="1806"/>
+            <w:vAlign w:val="center"/>
+            <w:shd w:fill="F2F6FA"/>
+          </w:tcPr>
+          <w:p>
+            <w:r>
+              <w:rPr>
+                <w:sz w:val="16"/>
+              </w:rPr>
+              <w:t>Cliente autenticado.</w:t>
+            </w:r>
+          </w:p>
+        </w:tc>
+        <w:tc>
+          <w:tcPr>
+            <w:tcW w:type="dxa" w:w="1806"/>
+            <w:vAlign w:val="center"/>
+            <w:shd w:fill="F2F6FA"/>
+          </w:tcPr>
+          <w:p>
+            <w:r>
+              <w:rPr>
+                <w:sz w:val="16"/>
+              </w:rPr>
+              <w:t>PedidoServico criado com status ABERTO.</w:t>
+            </w:r>
+          </w:p>
+        </w:tc>
+        <w:tc>
+          <w:tcPr>
+            <w:tcW w:type="dxa" w:w="1806"/>
+            <w:vAlign w:val="center"/>
+            <w:shd w:fill="F2F6FA"/>
+          </w:tcPr>
+          <w:p>
+            <w:r>
+              <w:rPr>
+                <w:sz w:val="16"/>
+              </w:rPr>
+              <w:t>UC-02; PedidoServico.java.</w:t>
+            </w:r>
+          </w:p>
+        </w:tc>
+      </w:tr>
+      <w:tr>
+        <w:tc>
+          <w:tcPr>
+            <w:tcW w:type="dxa" w:w="1806"/>
+            <w:vAlign w:val="center"/>
+          </w:tcPr>
+          <w:p>
+            <w:r>
+              <w:rPr>
+                <w:sz w:val="16"/>
+              </w:rPr>
+              <w:t>CT-03</w:t>
+            </w:r>
+          </w:p>
+        </w:tc>
+        <w:tc>
+          <w:tcPr>
+            <w:tcW w:type="dxa" w:w="1806"/>
+            <w:vAlign w:val="center"/>
+          </w:tcPr>
+          <w:p>
+            <w:r>
+              <w:rPr>
+                <w:sz w:val="16"/>
+              </w:rPr>
+              <w:t>Consultar demandas</w:t>
+            </w:r>
+          </w:p>
+        </w:tc>
+        <w:tc>
+          <w:tcPr>
+            <w:tcW w:type="dxa" w:w="1806"/>
+            <w:vAlign w:val="center"/>
+          </w:tcPr>
+          <w:p>
+            <w:r>
+              <w:rPr>
+                <w:sz w:val="16"/>
+              </w:rPr>
+              <w:t>Profissional autenticado.</w:t>
+            </w:r>
+          </w:p>
+        </w:tc>
+        <w:tc>
+          <w:tcPr>
+            <w:tcW w:type="dxa" w:w="1806"/>
+            <w:vAlign w:val="center"/>
+          </w:tcPr>
+          <w:p>
+            <w:r>
+              <w:rPr>
+                <w:sz w:val="16"/>
+              </w:rPr>
+              <w:t>Somente demandas abertas aparecem.</w:t>
+            </w:r>
+          </w:p>
+        </w:tc>
+        <w:tc>
+          <w:tcPr>
+            <w:tcW w:type="dxa" w:w="1806"/>
+            <w:vAlign w:val="center"/>
+          </w:tcPr>
+          <w:p>
+            <w:r>
+              <w:rPr>
+                <w:sz w:val="16"/>
+              </w:rPr>
+              <w:t>UC-03; PedidoController.java.</w:t>
+            </w:r>
+          </w:p>
+        </w:tc>
+      </w:tr>
+      <w:tr>
+        <w:tc>
+          <w:tcPr>
+            <w:tcW w:type="dxa" w:w="1806"/>
+            <w:vAlign w:val="center"/>
+            <w:shd w:fill="F2F6FA"/>
+          </w:tcPr>
+          <w:p>
+            <w:r>
+              <w:rPr>
+                <w:sz w:val="16"/>
+              </w:rPr>
+              <w:t>CT-04</w:t>
+            </w:r>
+          </w:p>
+        </w:tc>
+        <w:tc>
+          <w:tcPr>
+            <w:tcW w:type="dxa" w:w="1806"/>
+            <w:vAlign w:val="center"/>
+            <w:shd w:fill="F2F6FA"/>
+          </w:tcPr>
+          <w:p>
+            <w:r>
+              <w:rPr>
+                <w:sz w:val="16"/>
+              </w:rPr>
+              <w:t>Aceitar demanda</w:t>
+            </w:r>
+          </w:p>
+        </w:tc>
+        <w:tc>
+          <w:tcPr>
+            <w:tcW w:type="dxa" w:w="1806"/>
+            <w:vAlign w:val="center"/>
+            <w:shd w:fill="F2F6FA"/>
+          </w:tcPr>
+          <w:p>
+            <w:r>
+              <w:rPr>
+                <w:sz w:val="16"/>
+              </w:rPr>
+              <w:t>Profissional validado e demanda aberta.</w:t>
+            </w:r>
+          </w:p>
+        </w:tc>
+        <w:tc>
+          <w:tcPr>
+            <w:tcW w:type="dxa" w:w="1806"/>
+            <w:vAlign w:val="center"/>
+            <w:shd w:fill="F2F6FA"/>
+          </w:tcPr>
+          <w:p>
+            <w:r>
+              <w:rPr>
+                <w:sz w:val="16"/>
+              </w:rPr>
+              <w:t>Profissional associado e status ACEITO.</w:t>
+            </w:r>
+          </w:p>
+        </w:tc>
+        <w:tc>
+          <w:tcPr>
+            <w:tcW w:type="dxa" w:w="1806"/>
+            <w:vAlign w:val="center"/>
+            <w:shd w:fill="F2F6FA"/>
+          </w:tcPr>
+          <w:p>
+            <w:r>
+              <w:rPr>
+                <w:sz w:val="16"/>
+              </w:rPr>
+              <w:t>UC-04; PedidoServico.aceitar().</w:t>
+            </w:r>
+          </w:p>
+        </w:tc>
+      </w:tr>
+      <w:tr>
+        <w:tc>
+          <w:tcPr>
+            <w:tcW w:type="dxa" w:w="1806"/>
+            <w:vAlign w:val="center"/>
+          </w:tcPr>
+          <w:p>
+            <w:r>
+              <w:rPr>
+                <w:sz w:val="16"/>
+              </w:rPr>
+              <w:t>CT-05</w:t>
+            </w:r>
+          </w:p>
+        </w:tc>
+        <w:tc>
+          <w:tcPr>
+            <w:tcW w:type="dxa" w:w="1806"/>
+            <w:vAlign w:val="center"/>
+          </w:tcPr>
+          <w:p>
+            <w:r>
+              <w:rPr>
+                <w:sz w:val="16"/>
+              </w:rPr>
+              <w:t>Finalizar serviço</w:t>
+            </w:r>
+          </w:p>
+        </w:tc>
+        <w:tc>
+          <w:tcPr>
+            <w:tcW w:type="dxa" w:w="1806"/>
+            <w:vAlign w:val="center"/>
+          </w:tcPr>
+          <w:p>
+            <w:r>
+              <w:rPr>
+                <w:sz w:val="16"/>
+              </w:rPr>
+              <w:t>Profissional associado e status ACEITO.</w:t>
+            </w:r>
+          </w:p>
+        </w:tc>
+        <w:tc>
+          <w:tcPr>
+            <w:tcW w:type="dxa" w:w="1806"/>
+            <w:vAlign w:val="center"/>
+          </w:tcPr>
+          <w:p>
+            <w:r>
+              <w:rPr>
+                <w:sz w:val="16"/>
+              </w:rPr>
+              <w:t>Status FINALIZADO; operação de terceiro recusada.</w:t>
+            </w:r>
+          </w:p>
+        </w:tc>
+        <w:tc>
+          <w:tcPr>
+            <w:tcW w:type="dxa" w:w="1806"/>
+            <w:vAlign w:val="center"/>
+          </w:tcPr>
+          <w:p>
+            <w:r>
+              <w:rPr>
+                <w:sz w:val="16"/>
+              </w:rPr>
+              <w:t>UC-05; PedidoServico.finalizar().</w:t>
+            </w:r>
+          </w:p>
+        </w:tc>
+      </w:tr>
+      <w:tr>
+        <w:tc>
+          <w:tcPr>
+            <w:tcW w:type="dxa" w:w="1806"/>
+            <w:vAlign w:val="center"/>
+            <w:shd w:fill="F2F6FA"/>
+          </w:tcPr>
+          <w:p>
+            <w:r>
+              <w:rPr>
+                <w:sz w:val="16"/>
+              </w:rPr>
+              <w:t>CT-06</w:t>
+            </w:r>
+          </w:p>
+        </w:tc>
+        <w:tc>
+          <w:tcPr>
+            <w:tcW w:type="dxa" w:w="1806"/>
+            <w:vAlign w:val="center"/>
+            <w:shd w:fill="F2F6FA"/>
+          </w:tcPr>
+          <w:p>
+            <w:r>
+              <w:rPr>
+                <w:sz w:val="16"/>
+              </w:rPr>
+              <w:t>Avaliar profissional</w:t>
+            </w:r>
+          </w:p>
+        </w:tc>
+        <w:tc>
+          <w:tcPr>
+            <w:tcW w:type="dxa" w:w="1806"/>
+            <w:vAlign w:val="center"/>
+            <w:shd w:fill="F2F6FA"/>
+          </w:tcPr>
+          <w:p>
+            <w:r>
+              <w:rPr>
+                <w:sz w:val="16"/>
+              </w:rPr>
+              <w:t>Demanda finalizada; nota de 1 a 5.</w:t>
+            </w:r>
+          </w:p>
+        </w:tc>
+        <w:tc>
+          <w:tcPr>
+            <w:tcW w:type="dxa" w:w="1806"/>
+            <w:vAlign w:val="center"/>
+            <w:shd w:fill="F2F6FA"/>
+          </w:tcPr>
+          <w:p>
+            <w:r>
+              <w:rPr>
+                <w:sz w:val="16"/>
+              </w:rPr>
+              <w:t>Avaliação persistida; nota inválida recusada.</w:t>
+            </w:r>
+          </w:p>
+        </w:tc>
+        <w:tc>
+          <w:tcPr>
+            <w:tcW w:type="dxa" w:w="1806"/>
+            <w:vAlign w:val="center"/>
+            <w:shd w:fill="F2F6FA"/>
+          </w:tcPr>
+          <w:p>
+            <w:r>
+              <w:rPr>
+                <w:sz w:val="16"/>
+              </w:rPr>
+              <w:t>UC-06; Avaliacao.java.</w:t>
+            </w:r>
+          </w:p>
+        </w:tc>
+      </w:tr>
+      <w:tr>
+        <w:tc>
+          <w:tcPr>
+            <w:tcW w:type="dxa" w:w="1806"/>
+            <w:vAlign w:val="center"/>
+          </w:tcPr>
+          <w:p>
+            <w:r>
+              <w:rPr>
+                <w:sz w:val="16"/>
+              </w:rPr>
+              <w:t>CT-07</w:t>
+            </w:r>
+          </w:p>
+        </w:tc>
+        <w:tc>
+          <w:tcPr>
+            <w:tcW w:type="dxa" w:w="1806"/>
+            <w:vAlign w:val="center"/>
+          </w:tcPr>
+          <w:p>
+            <w:r>
+              <w:rPr>
+                <w:sz w:val="16"/>
+              </w:rPr>
+              <w:t>Moderar cadastro</w:t>
+            </w:r>
+          </w:p>
+        </w:tc>
+        <w:tc>
+          <w:tcPr>
+            <w:tcW w:type="dxa" w:w="1806"/>
+            <w:vAlign w:val="center"/>
+          </w:tcPr>
+          <w:p>
+            <w:r>
+              <w:rPr>
+                <w:sz w:val="16"/>
+              </w:rPr>
+              <w:t>Administrador autenticado.</w:t>
+            </w:r>
+          </w:p>
+        </w:tc>
+        <w:tc>
+          <w:tcPr>
+            <w:tcW w:type="dxa" w:w="1806"/>
+            <w:vAlign w:val="center"/>
+          </w:tcPr>
+          <w:p>
+            <w:r>
+              <w:rPr>
+                <w:sz w:val="16"/>
+              </w:rPr>
+              <w:t>Status de cadastro alterado; acesso indevido recusado.</w:t>
+            </w:r>
+          </w:p>
+        </w:tc>
+        <w:tc>
+          <w:tcPr>
+            <w:tcW w:type="dxa" w:w="1806"/>
+            <w:vAlign w:val="center"/>
+          </w:tcPr>
+          <w:p>
+            <w:r>
+              <w:rPr>
+                <w:sz w:val="16"/>
+              </w:rPr>
+              <w:t>UC-07; Profissional.validarCadastro().</w:t>
+            </w:r>
+          </w:p>
+        </w:tc>
+      </w:tr>
+    </w:tbl>
+    <w:p/>
+    <w:p>
+      <w:pPr>
+        <w:pStyle w:val="Heading2"/>
+      </w:pPr>
+      <w:r>
+        <w:t>16.3 Registro de defeitos e melhorias</w:t>
+      </w:r>
+    </w:p>
+    <w:tbl>
+      <w:tblPr>
+        <w:tblW w:type="auto" w:w="0"/>
+        <w:tblLook w:firstColumn="1" w:firstRow="1" w:lastColumn="0" w:lastRow="0" w:noHBand="0" w:noVBand="1" w:val="04A0"/>
+        <w:tblBorders>
+          <w:top w:val="single" w:sz="4" w:color="D9D9D9"/>
+          <w:left w:val="single" w:sz="4" w:color="D9D9D9"/>
+          <w:bottom w:val="single" w:sz="4" w:color="D9D9D9"/>
+          <w:right w:val="single" w:sz="4" w:color="D9D9D9"/>
+          <w:insideH w:val="single" w:sz="4" w:color="D9D9D9"/>
+          <w:insideV w:val="single" w:sz="4" w:color="D9D9D9"/>
+        </w:tblBorders>
+      </w:tblPr>
+      <w:tblGrid>
+        <w:gridCol w:w="2257"/>
+        <w:gridCol w:w="2257"/>
+        <w:gridCol w:w="2257"/>
+        <w:gridCol w:w="2257"/>
+      </w:tblGrid>
+      <w:tr>
+        <w:tc>
+          <w:tcPr>
+            <w:tcW w:type="dxa" w:w="2257"/>
+            <w:shd w:fill="1F4E78"/>
+          </w:tcPr>
+          <w:p>
+            <w:r>
+              <w:rPr>
+                <w:b/>
+                <w:color w:val="FFFFFF"/>
+                <w:sz w:val="16"/>
+              </w:rPr>
+              <w:t>ID</w:t>
+            </w:r>
+          </w:p>
+        </w:tc>
+        <w:tc>
+          <w:tcPr>
+            <w:tcW w:type="dxa" w:w="2257"/>
+            <w:shd w:fill="1F4E78"/>
+          </w:tcPr>
+          <w:p>
+            <w:r>
+              <w:rPr>
+                <w:b/>
+                <w:color w:val="FFFFFF"/>
+                <w:sz w:val="16"/>
+              </w:rPr>
+              <w:t>Registro</w:t>
+            </w:r>
+          </w:p>
+        </w:tc>
+        <w:tc>
+          <w:tcPr>
+            <w:tcW w:type="dxa" w:w="2257"/>
+            <w:shd w:fill="1F4E78"/>
+          </w:tcPr>
+          <w:p>
+            <w:r>
+              <w:rPr>
+                <w:b/>
+                <w:color w:val="FFFFFF"/>
+                <w:sz w:val="16"/>
+              </w:rPr>
+              <w:t>Classificação</w:t>
+            </w:r>
+          </w:p>
+        </w:tc>
+        <w:tc>
+          <w:tcPr>
+            <w:tcW w:type="dxa" w:w="2257"/>
+            <w:shd w:fill="1F4E78"/>
+          </w:tcPr>
+          <w:p>
+            <w:r>
+              <w:rPr>
+                <w:b/>
+                <w:color w:val="FFFFFF"/>
+                <w:sz w:val="16"/>
+              </w:rPr>
+              <w:t>Tratamento/evidência</w:t>
+            </w:r>
+          </w:p>
+        </w:tc>
+      </w:tr>
+      <w:tr>
+        <w:tc>
+          <w:tcPr>
+            <w:tcW w:type="dxa" w:w="2257"/>
+            <w:vAlign w:val="center"/>
+          </w:tcPr>
+          <w:p>
+            <w:r>
+              <w:rPr>
+                <w:sz w:val="16"/>
+              </w:rPr>
+              <w:t>DF-01</w:t>
+            </w:r>
+          </w:p>
+        </w:tc>
+        <w:tc>
+          <w:tcPr>
+            <w:tcW w:type="dxa" w:w="2257"/>
+            <w:vAlign w:val="center"/>
+          </w:tcPr>
+          <w:p>
+            <w:r>
+              <w:rPr>
+                <w:sz w:val="16"/>
+              </w:rPr>
+              <w:t>Código DER recebido com HTML escapado.</w:t>
+            </w:r>
+          </w:p>
+        </w:tc>
+        <w:tc>
+          <w:tcPr>
+            <w:tcW w:type="dxa" w:w="2257"/>
+            <w:vAlign w:val="center"/>
+          </w:tcPr>
+          <w:p>
+            <w:r>
+              <w:rPr>
+                <w:sz w:val="16"/>
+              </w:rPr>
+              <w:t>Defeito documental</w:t>
+            </w:r>
+          </w:p>
+        </w:tc>
+        <w:tc>
+          <w:tcPr>
+            <w:tcW w:type="dxa" w:w="2257"/>
+            <w:vAlign w:val="center"/>
+          </w:tcPr>
+          <w:p>
+            <w:r>
+              <w:rPr>
+                <w:sz w:val="16"/>
+              </w:rPr>
+              <w:t>Corrigido em docs/uml/13.1-der-construmob.puml; commit 6cd46f9.</w:t>
+            </w:r>
+          </w:p>
+        </w:tc>
+      </w:tr>
+      <w:tr>
+        <w:tc>
+          <w:tcPr>
+            <w:tcW w:type="dxa" w:w="2257"/>
+            <w:vAlign w:val="center"/>
+            <w:shd w:fill="F2F6FA"/>
+          </w:tcPr>
+          <w:p>
+            <w:r>
+              <w:rPr>
+                <w:sz w:val="16"/>
+              </w:rPr>
+              <w:t>DF-02</w:t>
+            </w:r>
+          </w:p>
+        </w:tc>
+        <w:tc>
+          <w:tcPr>
+            <w:tcW w:type="dxa" w:w="2257"/>
+            <w:vAlign w:val="center"/>
+            <w:shd w:fill="F2F6FA"/>
+          </w:tcPr>
+          <w:p>
+            <w:r>
+              <w:rPr>
+                <w:sz w:val="16"/>
+              </w:rPr>
+              <w:t>Nomes do DER divergiam do schema.sql.</w:t>
+            </w:r>
+          </w:p>
+        </w:tc>
+        <w:tc>
+          <w:tcPr>
+            <w:tcW w:type="dxa" w:w="2257"/>
+            <w:vAlign w:val="center"/>
+            <w:shd w:fill="F2F6FA"/>
+          </w:tcPr>
+          <w:p>
+            <w:r>
+              <w:rPr>
+                <w:sz w:val="16"/>
+              </w:rPr>
+              <w:t>Defeito de rastreabilidade</w:t>
+            </w:r>
+          </w:p>
+        </w:tc>
+        <w:tc>
+          <w:tcPr>
+            <w:tcW w:type="dxa" w:w="2257"/>
+            <w:vAlign w:val="center"/>
+            <w:shd w:fill="F2F6FA"/>
+          </w:tcPr>
+          <w:p>
+            <w:r>
+              <w:rPr>
+                <w:sz w:val="16"/>
+              </w:rPr>
+              <w:t>Alinhado a database/schema.sql; commit 37389be.</w:t>
+            </w:r>
+          </w:p>
+        </w:tc>
+      </w:tr>
+      <w:tr>
+        <w:tc>
+          <w:tcPr>
+            <w:tcW w:type="dxa" w:w="2257"/>
+            <w:vAlign w:val="center"/>
+          </w:tcPr>
+          <w:p>
+            <w:r>
+              <w:rPr>
+                <w:sz w:val="16"/>
+              </w:rPr>
+              <w:t>MF-01</w:t>
+            </w:r>
+          </w:p>
+        </w:tc>
+        <w:tc>
+          <w:tcPr>
+            <w:tcW w:type="dxa" w:w="2257"/>
+            <w:vAlign w:val="center"/>
+          </w:tcPr>
+          <w:p>
+            <w:r>
+              <w:rPr>
+                <w:sz w:val="16"/>
+              </w:rPr>
+              <w:t>Links genéricos dos protótipos.</w:t>
+            </w:r>
+          </w:p>
+        </w:tc>
+        <w:tc>
+          <w:tcPr>
+            <w:tcW w:type="dxa" w:w="2257"/>
+            <w:vAlign w:val="center"/>
+          </w:tcPr>
+          <w:p>
+            <w:r>
+              <w:rPr>
+                <w:sz w:val="16"/>
+              </w:rPr>
+              <w:t>Melhoria</w:t>
+            </w:r>
+          </w:p>
+        </w:tc>
+        <w:tc>
+          <w:tcPr>
+            <w:tcW w:type="dxa" w:w="2257"/>
+            <w:vAlign w:val="center"/>
+          </w:tcPr>
+          <w:p>
+            <w:r>
+              <w:rPr>
+                <w:sz w:val="16"/>
+              </w:rPr>
+              <w:t>Substituídos por URLs diretas na Seção 15.2.</w:t>
+            </w:r>
+          </w:p>
+        </w:tc>
+      </w:tr>
+      <w:tr>
+        <w:tc>
+          <w:tcPr>
+            <w:tcW w:type="dxa" w:w="2257"/>
+            <w:vAlign w:val="center"/>
+            <w:shd w:fill="F2F6FA"/>
+          </w:tcPr>
+          <w:p>
+            <w:r>
+              <w:rPr>
+                <w:sz w:val="16"/>
+              </w:rPr>
+              <w:t>MF-02</w:t>
+            </w:r>
+          </w:p>
+        </w:tc>
+        <w:tc>
+          <w:tcPr>
+            <w:tcW w:type="dxa" w:w="2257"/>
+            <w:vAlign w:val="center"/>
+            <w:shd w:fill="F2F6FA"/>
+          </w:tcPr>
+          <w:p>
+            <w:r>
+              <w:rPr>
+                <w:sz w:val="16"/>
+              </w:rPr>
+              <w:t>Fluxos descritos sem imagem.</w:t>
+            </w:r>
+          </w:p>
+        </w:tc>
+        <w:tc>
+          <w:tcPr>
+            <w:tcW w:type="dxa" w:w="2257"/>
+            <w:vAlign w:val="center"/>
+            <w:shd w:fill="F2F6FA"/>
+          </w:tcPr>
+          <w:p>
+            <w:r>
+              <w:rPr>
+                <w:sz w:val="16"/>
+              </w:rPr>
+              <w:t>Melhoria</w:t>
+            </w:r>
+          </w:p>
+        </w:tc>
+        <w:tc>
+          <w:tcPr>
+            <w:tcW w:type="dxa" w:w="2257"/>
+            <w:vAlign w:val="center"/>
+            <w:shd w:fill="F2F6FA"/>
+          </w:tcPr>
+          <w:p>
+            <w:r>
+              <w:rPr>
+                <w:sz w:val="16"/>
+              </w:rPr>
+              <w:t>Imagens dos três perfis adicionadas à Seção 15.3.</w:t>
+            </w:r>
+          </w:p>
+        </w:tc>
+      </w:tr>
+    </w:tbl>
+    <w:p/>
+    <w:p>
+      <w:r>
+        <w:br w:type="page"/>
+      </w:r>
+    </w:p>
+    <w:p>
+      <w:pPr>
+        <w:pStyle w:val="Heading1"/>
+      </w:pPr>
+      <w:r>
+        <w:t>17. Implementação do MVP</w:t>
+      </w:r>
+    </w:p>
+    <w:p>
+      <w:pPr>
+        <w:pStyle w:val="Heading2"/>
+      </w:pPr>
+      <w:r>
+        <w:t>17.1 Funcionalidades implementadas</w:t>
+      </w:r>
+    </w:p>
+    <w:tbl>
+      <w:tblPr>
+        <w:tblW w:type="auto" w:w="0"/>
+        <w:tblLook w:firstColumn="1" w:firstRow="1" w:lastColumn="0" w:lastRow="0" w:noHBand="0" w:noVBand="1" w:val="04A0"/>
+        <w:tblBorders>
+          <w:top w:val="single" w:sz="4" w:color="D9D9D9"/>
+          <w:left w:val="single" w:sz="4" w:color="D9D9D9"/>
+          <w:bottom w:val="single" w:sz="4" w:color="D9D9D9"/>
+          <w:right w:val="single" w:sz="4" w:color="D9D9D9"/>
+          <w:insideH w:val="single" w:sz="4" w:color="D9D9D9"/>
+          <w:insideV w:val="single" w:sz="4" w:color="D9D9D9"/>
+        </w:tblBorders>
+      </w:tblPr>
+      <w:tblGrid>
+        <w:gridCol w:w="3010"/>
+        <w:gridCol w:w="3010"/>
+        <w:gridCol w:w="3010"/>
+      </w:tblGrid>
+      <w:tr>
+        <w:tc>
+          <w:tcPr>
+            <w:tcW w:type="dxa" w:w="3010"/>
+            <w:shd w:fill="1F4E78"/>
+          </w:tcPr>
+          <w:p>
+            <w:r>
+              <w:rPr>
+                <w:b/>
+                <w:color w:val="FFFFFF"/>
+                <w:sz w:val="16"/>
+              </w:rPr>
+              <w:t>Funcionalidade</w:t>
+            </w:r>
+          </w:p>
+        </w:tc>
+        <w:tc>
+          <w:tcPr>
+            <w:tcW w:type="dxa" w:w="3010"/>
+            <w:shd w:fill="1F4E78"/>
+          </w:tcPr>
+          <w:p>
+            <w:r>
+              <w:rPr>
+                <w:b/>
+                <w:color w:val="FFFFFF"/>
+                <w:sz w:val="16"/>
+              </w:rPr>
+              <w:t>Implementação</w:t>
+            </w:r>
+          </w:p>
+        </w:tc>
+        <w:tc>
+          <w:tcPr>
+            <w:tcW w:type="dxa" w:w="3010"/>
+            <w:shd w:fill="1F4E78"/>
+          </w:tcPr>
+          <w:p>
+            <w:r>
+              <w:rPr>
+                <w:b/>
+                <w:color w:val="FFFFFF"/>
+                <w:sz w:val="16"/>
+              </w:rPr>
+              <w:t>Evidência</w:t>
+            </w:r>
+          </w:p>
+        </w:tc>
+      </w:tr>
+      <w:tr>
+        <w:tc>
+          <w:tcPr>
+            <w:tcW w:type="dxa" w:w="3010"/>
+            <w:vAlign w:val="center"/>
+          </w:tcPr>
+          <w:p>
+            <w:r>
+              <w:rPr>
+                <w:sz w:val="16"/>
+              </w:rPr>
+              <w:t>Catálogo e solicitação</w:t>
+            </w:r>
+          </w:p>
+        </w:tc>
+        <w:tc>
+          <w:tcPr>
+            <w:tcW w:type="dxa" w:w="3010"/>
+            <w:vAlign w:val="center"/>
+          </w:tcPr>
+          <w:p>
+            <w:r>
+              <w:rPr>
+                <w:sz w:val="16"/>
+              </w:rPr>
+              <w:t>Servico, PedidoServico e ItemServico.</w:t>
+            </w:r>
+          </w:p>
+        </w:tc>
+        <w:tc>
+          <w:tcPr>
+            <w:tcW w:type="dxa" w:w="3010"/>
+            <w:vAlign w:val="center"/>
+          </w:tcPr>
+          <w:p>
+            <w:r>
+              <w:rPr>
+                <w:sz w:val="16"/>
+              </w:rPr>
+              <w:t>src/main/java/.../domain e database/schema.sql.</w:t>
+            </w:r>
+          </w:p>
+        </w:tc>
+      </w:tr>
+      <w:tr>
+        <w:tc>
+          <w:tcPr>
+            <w:tcW w:type="dxa" w:w="3010"/>
+            <w:vAlign w:val="center"/>
+            <w:shd w:fill="F2F6FA"/>
+          </w:tcPr>
+          <w:p>
+            <w:r>
+              <w:rPr>
+                <w:sz w:val="16"/>
+              </w:rPr>
+              <w:t>Aceite e atendimento</w:t>
+            </w:r>
+          </w:p>
+        </w:tc>
+        <w:tc>
+          <w:tcPr>
+            <w:tcW w:type="dxa" w:w="3010"/>
+            <w:vAlign w:val="center"/>
+            <w:shd w:fill="F2F6FA"/>
+          </w:tcPr>
+          <w:p>
+            <w:r>
+              <w:rPr>
+                <w:sz w:val="16"/>
+              </w:rPr>
+              <w:t>Estado StatusPedido e operações aceitar/finalizar/cancelar.</w:t>
+            </w:r>
+          </w:p>
+        </w:tc>
+        <w:tc>
+          <w:tcPr>
+            <w:tcW w:type="dxa" w:w="3010"/>
+            <w:vAlign w:val="center"/>
+            <w:shd w:fill="F2F6FA"/>
+          </w:tcPr>
+          <w:p>
+            <w:r>
+              <w:rPr>
+                <w:sz w:val="16"/>
+              </w:rPr>
+              <w:t>PedidoServico.java e PedidoService.java.</w:t>
+            </w:r>
+          </w:p>
+        </w:tc>
+      </w:tr>
+      <w:tr>
+        <w:tc>
+          <w:tcPr>
+            <w:tcW w:type="dxa" w:w="3010"/>
+            <w:vAlign w:val="center"/>
+          </w:tcPr>
+          <w:p>
+            <w:r>
+              <w:rPr>
+                <w:sz w:val="16"/>
+              </w:rPr>
+              <w:t>Avaliação</w:t>
+            </w:r>
+          </w:p>
+        </w:tc>
+        <w:tc>
+          <w:tcPr>
+            <w:tcW w:type="dxa" w:w="3010"/>
+            <w:vAlign w:val="center"/>
+          </w:tcPr>
+          <w:p>
+            <w:r>
+              <w:rPr>
+                <w:sz w:val="16"/>
+              </w:rPr>
+              <w:t>Nota, comentário e restrição após finalização.</w:t>
+            </w:r>
+          </w:p>
+        </w:tc>
+        <w:tc>
+          <w:tcPr>
+            <w:tcW w:type="dxa" w:w="3010"/>
+            <w:vAlign w:val="center"/>
+          </w:tcPr>
+          <w:p>
+            <w:r>
+              <w:rPr>
+                <w:sz w:val="16"/>
+              </w:rPr>
+              <w:t>Avaliacao.java e AvaliacaoService.java.</w:t>
+            </w:r>
+          </w:p>
+        </w:tc>
+      </w:tr>
+      <w:tr>
+        <w:tc>
+          <w:tcPr>
+            <w:tcW w:type="dxa" w:w="3010"/>
+            <w:vAlign w:val="center"/>
+            <w:shd w:fill="F2F6FA"/>
+          </w:tcPr>
+          <w:p>
+            <w:r>
+              <w:rPr>
+                <w:sz w:val="16"/>
+              </w:rPr>
+              <w:t>Persistência</w:t>
+            </w:r>
+          </w:p>
+        </w:tc>
+        <w:tc>
+          <w:tcPr>
+            <w:tcW w:type="dxa" w:w="3010"/>
+            <w:vAlign w:val="center"/>
+            <w:shd w:fill="F2F6FA"/>
+          </w:tcPr>
+          <w:p>
+            <w:r>
+              <w:rPr>
+                <w:sz w:val="16"/>
+              </w:rPr>
+              <w:t>Repositories Spring Data JPA e MySQL.</w:t>
+            </w:r>
+          </w:p>
+        </w:tc>
+        <w:tc>
+          <w:tcPr>
+            <w:tcW w:type="dxa" w:w="3010"/>
+            <w:vAlign w:val="center"/>
+            <w:shd w:fill="F2F6FA"/>
+          </w:tcPr>
+          <w:p>
+            <w:r>
+              <w:rPr>
+                <w:sz w:val="16"/>
+              </w:rPr>
+              <w:t>src/main/java/.../repository e docker-compose.yml.</w:t>
+            </w:r>
+          </w:p>
+        </w:tc>
+      </w:tr>
+      <w:tr>
+        <w:tc>
+          <w:tcPr>
+            <w:tcW w:type="dxa" w:w="3010"/>
+            <w:vAlign w:val="center"/>
+          </w:tcPr>
+          <w:p>
+            <w:r>
+              <w:rPr>
+                <w:sz w:val="16"/>
+              </w:rPr>
+              <w:t>Interface</w:t>
+            </w:r>
+          </w:p>
+        </w:tc>
+        <w:tc>
+          <w:tcPr>
+            <w:tcW w:type="dxa" w:w="3010"/>
+            <w:vAlign w:val="center"/>
+          </w:tcPr>
+          <w:p>
+            <w:r>
+              <w:rPr>
+                <w:sz w:val="16"/>
+              </w:rPr>
+              <w:t>Templates Thymeleaf e recursos estáticos.</w:t>
+            </w:r>
+          </w:p>
+        </w:tc>
+        <w:tc>
+          <w:tcPr>
+            <w:tcW w:type="dxa" w:w="3010"/>
+            <w:vAlign w:val="center"/>
+          </w:tcPr>
+          <w:p>
+            <w:r>
+              <w:rPr>
+                <w:sz w:val="16"/>
+              </w:rPr>
+              <w:t>src/main/resources/templates e static.</w:t>
+            </w:r>
+          </w:p>
+        </w:tc>
+      </w:tr>
+    </w:tbl>
+    <w:p/>
+    <w:p>
+      <w:pPr>
+        <w:pStyle w:val="Heading2"/>
+      </w:pPr>
+      <w:r>
+        <w:t>17.2 Demonstração do sistema</w:t>
+      </w:r>
+    </w:p>
+    <w:p>
+      <w:r>
+        <w:t>Para executar localmente, instale Java 21, Maven e Docker; execute docker compose up -d, confirme o banco construmob e depois mvn spring-boot:run. A aplicação fica disponível em http://localhost:8080. Os protótipos HTML podem ser abertos diretamente a partir de docs/prototypes. Como não há credenciais padrão versionadas, o avaliador deve criar registros de teste; não utilizar dados pessoais reais.</w:t>
+      </w:r>
+    </w:p>
+    <w:p>
+      <w:r>
+        <w:t xml:space="preserve">Commit da implementação documental e UML: </w:t>
+      </w:r>
+      <w:hyperlink r:id="rId96">
+        <w:r>
+          <w:rPr>
+            <w:color w:val="0563C1"/>
+            <w:u w:val="single"/>
+          </w:rPr>
+          <w:t>https://github.com/GPSMiranda/CONSTRUMOB-SISTEMA-DE-UBERIZA-O-PARA-SERVI-OS-DE-CONSTRU-O-CIVIL/blob/codex/prototipos/commit/6cd46f9</w:t>
+        </w:r>
+      </w:hyperlink>
+    </w:p>
+    <w:p>
+      <w:r>
+        <w:t xml:space="preserve">Código do MVP: </w:t>
+      </w:r>
+      <w:hyperlink r:id="rId97">
+        <w:r>
+          <w:rPr>
+            <w:color w:val="0563C1"/>
+            <w:u w:val="single"/>
+          </w:rPr>
+          <w:t>https://github.com/GPSMiranda/CONSTRUMOB-SISTEMA-DE-UBERIZA-O-PARA-SERVI-OS-DE-CONSTRU-O-CIVIL/blob/codex/prototipos/tree/codex/prototipos/src/main/java</w:t>
+        </w:r>
+      </w:hyperlink>
+    </w:p>
+    <w:p>
+      <w:r>
+        <w:t xml:space="preserve">Schema do banco: </w:t>
+      </w:r>
+      <w:hyperlink r:id="rId98">
+        <w:r>
+          <w:rPr>
+            <w:color w:val="0563C1"/>
+            <w:u w:val="single"/>
+          </w:rPr>
+          <w:t>https://github.com/GPSMiranda/CONSTRUMOB-SISTEMA-DE-UBERIZA-O-PARA-SERVI-OS-DE-CONSTRU-O-CIVIL/blob/codex/prototipos/blob/codex/prototipos/database/schema.sql</w:t>
+        </w:r>
+      </w:hyperlink>
+    </w:p>
+    <w:p>
+      <w:r>
+        <w:t xml:space="preserve">Docker Compose: </w:t>
+      </w:r>
+      <w:hyperlink r:id="rId99">
+        <w:r>
+          <w:rPr>
+            <w:color w:val="0563C1"/>
+            <w:u w:val="single"/>
+          </w:rPr>
+          <w:t>https://github.com/GPSMiranda/CONSTRUMOB-SISTEMA-DE-UBERIZA-O-PARA-SERVI-OS-DE-CONSTRU-O-CIVIL/blob/codex/prototipos/blob/codex/prototipos/docker-compose.yml</w:t>
+        </w:r>
+      </w:hyperlink>
+    </w:p>
+    <w:p>
+      <w:pPr>
+        <w:pStyle w:val="Heading2"/>
+      </w:pPr>
+      <w:r>
+        <w:t>17.3 Contribuição individual</w:t>
+      </w:r>
+    </w:p>
+    <w:tbl>
+      <w:tblPr>
+        <w:tblW w:type="auto" w:w="0"/>
+        <w:tblLook w:firstColumn="1" w:firstRow="1" w:lastColumn="0" w:lastRow="0" w:noHBand="0" w:noVBand="1" w:val="04A0"/>
+        <w:tblBorders>
+          <w:top w:val="single" w:sz="4" w:color="D9D9D9"/>
+          <w:left w:val="single" w:sz="4" w:color="D9D9D9"/>
+          <w:bottom w:val="single" w:sz="4" w:color="D9D9D9"/>
+          <w:right w:val="single" w:sz="4" w:color="D9D9D9"/>
+          <w:insideH w:val="single" w:sz="4" w:color="D9D9D9"/>
+          <w:insideV w:val="single" w:sz="4" w:color="D9D9D9"/>
+        </w:tblBorders>
+      </w:tblPr>
+      <w:tblGrid>
+        <w:gridCol w:w="3010"/>
+        <w:gridCol w:w="3010"/>
+        <w:gridCol w:w="3010"/>
+      </w:tblGrid>
+      <w:tr>
+        <w:tc>
+          <w:tcPr>
+            <w:tcW w:type="dxa" w:w="3010"/>
+            <w:shd w:fill="1F4E78"/>
+          </w:tcPr>
+          <w:p>
+            <w:r>
+              <w:rPr>
+                <w:b/>
+                <w:color w:val="FFFFFF"/>
+                <w:sz w:val="16"/>
+              </w:rPr>
+              <w:t>Responsável</w:t>
+            </w:r>
+          </w:p>
+        </w:tc>
+        <w:tc>
+          <w:tcPr>
+            <w:tcW w:type="dxa" w:w="3010"/>
+            <w:shd w:fill="1F4E78"/>
+          </w:tcPr>
+          <w:p>
+            <w:r>
+              <w:rPr>
+                <w:b/>
+                <w:color w:val="FFFFFF"/>
+                <w:sz w:val="16"/>
+              </w:rPr>
+              <w:t>Contribuições verificáveis</w:t>
+            </w:r>
+          </w:p>
+        </w:tc>
+        <w:tc>
+          <w:tcPr>
+            <w:tcW w:type="dxa" w:w="3010"/>
+            <w:shd w:fill="1F4E78"/>
+          </w:tcPr>
+          <w:p>
+            <w:r>
+              <w:rPr>
+                <w:b/>
+                <w:color w:val="FFFFFF"/>
+                <w:sz w:val="16"/>
+              </w:rPr>
+              <w:t>Evidência</w:t>
+            </w:r>
+          </w:p>
+        </w:tc>
+      </w:tr>
+      <w:tr>
+        <w:tc>
+          <w:tcPr>
+            <w:tcW w:type="dxa" w:w="3010"/>
+            <w:vAlign w:val="center"/>
+          </w:tcPr>
+          <w:p>
+            <w:r>
+              <w:rPr>
+                <w:sz w:val="16"/>
+              </w:rPr>
+              <w:t>Marcelo Chaves de Miranda</w:t>
+            </w:r>
+          </w:p>
+        </w:tc>
+        <w:tc>
+          <w:tcPr>
+            <w:tcW w:type="dxa" w:w="3010"/>
+            <w:vAlign w:val="center"/>
+          </w:tcPr>
+          <w:p>
+            <w:r>
+              <w:rPr>
+                <w:sz w:val="16"/>
+              </w:rPr>
+              <w:t>Análise, requisitos, UML, arquitetura, protótipos, documentação e integração do MVP.</w:t>
+            </w:r>
+          </w:p>
+        </w:tc>
+        <w:tc>
+          <w:tcPr>
+            <w:tcW w:type="dxa" w:w="3010"/>
+            <w:vAlign w:val="center"/>
+          </w:tcPr>
+          <w:p>
+            <w:r>
+              <w:rPr>
+                <w:sz w:val="16"/>
+              </w:rPr>
+              <w:t>Histórico Git da branch codex/prototipos e documentação em docs.</w:t>
+            </w:r>
+          </w:p>
+        </w:tc>
+      </w:tr>
+      <w:tr>
+        <w:tc>
+          <w:tcPr>
+            <w:tcW w:type="dxa" w:w="3010"/>
+            <w:vAlign w:val="center"/>
+            <w:shd w:fill="F2F6FA"/>
+          </w:tcPr>
+          <w:p>
+            <w:r>
+              <w:rPr>
+                <w:sz w:val="16"/>
+              </w:rPr>
+              <w:t>Equipe do projeto</w:t>
+            </w:r>
+          </w:p>
+        </w:tc>
+        <w:tc>
+          <w:tcPr>
+            <w:tcW w:type="dxa" w:w="3010"/>
+            <w:vAlign w:val="center"/>
+            <w:shd w:fill="F2F6FA"/>
+          </w:tcPr>
+          <w:p>
+            <w:r>
+              <w:rPr>
+                <w:sz w:val="16"/>
+              </w:rPr>
+              <w:t>Revisão das decisões e validação dos fluxos propostos.</w:t>
+            </w:r>
+          </w:p>
+        </w:tc>
+        <w:tc>
+          <w:tcPr>
+            <w:tcW w:type="dxa" w:w="3010"/>
+            <w:vAlign w:val="center"/>
+            <w:shd w:fill="F2F6FA"/>
+          </w:tcPr>
+          <w:p>
+            <w:r>
+              <w:rPr>
+                <w:sz w:val="16"/>
+              </w:rPr>
+              <w:t>Registros de elicitação e validação nos apêndices.</w:t>
+            </w:r>
+          </w:p>
+        </w:tc>
+      </w:tr>
+    </w:tbl>
+    <w:p/>
+    <w:p>
+      <w:r>
+        <w:br w:type="page"/>
+      </w:r>
+    </w:p>
+    <w:p>
+      <w:pPr>
+        <w:pStyle w:val="Heading1"/>
+      </w:pPr>
+      <w:r>
+        <w:t>18. Conclusão e referências</w:t>
+      </w:r>
+    </w:p>
+    <w:p>
+      <w:r>
+        <w:t>O CONSTRUMOB MVP apresenta uma solução web monolítica em camadas, com Controllers, Services, domínio e Repositories, usando Spring Boot, Thymeleaf, Bootstrap e MySQL. A implementação e os diagramas foram alinhados ao ciclo de publicação, consulta, aceite, finalização, avaliação e moderação. O modelo exclui pagamentos e mantém rastreabilidade entre requisitos, casos de uso, protótipos, persistência e testes.</w:t>
+      </w:r>
+    </w:p>
+    <w:p>
+      <w:pPr>
+        <w:pStyle w:val="Heading2"/>
+      </w:pPr>
+      <w:r>
+        <w:t>Referências</w:t>
+      </w:r>
+    </w:p>
+    <w:tbl>
+      <w:tblPr>
+        <w:tblW w:type="auto" w:w="0"/>
+        <w:tblLook w:firstColumn="1" w:firstRow="1" w:lastColumn="0" w:lastRow="0" w:noHBand="0" w:noVBand="1" w:val="04A0"/>
+        <w:tblBorders>
+          <w:top w:val="single" w:sz="4" w:color="D9D9D9"/>
+          <w:left w:val="single" w:sz="4" w:color="D9D9D9"/>
+          <w:bottom w:val="single" w:sz="4" w:color="D9D9D9"/>
+          <w:right w:val="single" w:sz="4" w:color="D9D9D9"/>
+          <w:insideH w:val="single" w:sz="4" w:color="D9D9D9"/>
+          <w:insideV w:val="single" w:sz="4" w:color="D9D9D9"/>
+        </w:tblBorders>
+      </w:tblPr>
+      <w:tblGrid>
+        <w:gridCol w:w="4514"/>
+        <w:gridCol w:w="4514"/>
+      </w:tblGrid>
+      <w:tr>
+        <w:tc>
+          <w:tcPr>
+            <w:tcW w:type="dxa" w:w="4514"/>
+            <w:shd w:fill="1F4E78"/>
+          </w:tcPr>
+          <w:p>
+            <w:r>
+              <w:rPr>
+                <w:b/>
+                <w:color w:val="FFFFFF"/>
+                <w:sz w:val="16"/>
+              </w:rPr>
+              <w:t>Referência</w:t>
+            </w:r>
+          </w:p>
+        </w:tc>
+        <w:tc>
+          <w:tcPr>
+            <w:tcW w:type="dxa" w:w="4514"/>
+            <w:shd w:fill="1F4E78"/>
+          </w:tcPr>
+          <w:p>
+            <w:r>
+              <w:rPr>
+                <w:b/>
+                <w:color w:val="FFFFFF"/>
+                <w:sz w:val="16"/>
+              </w:rPr>
+              <w:t>Uso na documentação</w:t>
+            </w:r>
+          </w:p>
+        </w:tc>
+      </w:tr>
+      <w:tr>
+        <w:tc>
+          <w:tcPr>
+            <w:tcW w:type="dxa" w:w="4514"/>
+            <w:vAlign w:val="center"/>
+          </w:tcPr>
+          <w:p>
+            <w:r>
+              <w:rPr>
+                <w:sz w:val="16"/>
+              </w:rPr>
+              <w:t>Spring Boot Documentation — https://docs.spring.io/spring-boot/documentation.html</w:t>
+            </w:r>
+          </w:p>
+        </w:tc>
+        <w:tc>
+          <w:tcPr>
+            <w:tcW w:type="dxa" w:w="4514"/>
+            <w:vAlign w:val="center"/>
+          </w:tcPr>
+          <w:p>
+            <w:r>
+              <w:rPr>
+                <w:sz w:val="16"/>
+              </w:rPr>
+              <w:t>Configuração e execução da aplicação.</w:t>
+            </w:r>
+          </w:p>
+        </w:tc>
+      </w:tr>
+      <w:tr>
+        <w:tc>
+          <w:tcPr>
+            <w:tcW w:type="dxa" w:w="4514"/>
+            <w:vAlign w:val="center"/>
+            <w:shd w:fill="F2F6FA"/>
+          </w:tcPr>
+          <w:p>
+            <w:r>
+              <w:rPr>
+                <w:sz w:val="16"/>
+              </w:rPr>
+              <w:t>Thymeleaf Documentation — https://www.thymeleaf.org/documentation.html</w:t>
+            </w:r>
+          </w:p>
+        </w:tc>
+        <w:tc>
+          <w:tcPr>
+            <w:tcW w:type="dxa" w:w="4514"/>
+            <w:vAlign w:val="center"/>
+            <w:shd w:fill="F2F6FA"/>
+          </w:tcPr>
+          <w:p>
+            <w:r>
+              <w:rPr>
+                <w:sz w:val="16"/>
+              </w:rPr>
+              <w:t>Renderização das interfaces server-side.</w:t>
+            </w:r>
+          </w:p>
+        </w:tc>
+      </w:tr>
+      <w:tr>
+        <w:tc>
+          <w:tcPr>
+            <w:tcW w:type="dxa" w:w="4514"/>
+            <w:vAlign w:val="center"/>
+          </w:tcPr>
+          <w:p>
+            <w:r>
+              <w:rPr>
+                <w:sz w:val="16"/>
+              </w:rPr>
+              <w:t>Bootstrap Documentation — https://getbootstrap.com/docs/5.3/</w:t>
+            </w:r>
+          </w:p>
+        </w:tc>
+        <w:tc>
+          <w:tcPr>
+            <w:tcW w:type="dxa" w:w="4514"/>
+            <w:vAlign w:val="center"/>
+          </w:tcPr>
+          <w:p>
+            <w:r>
+              <w:rPr>
+                <w:sz w:val="16"/>
+              </w:rPr>
+              <w:t>Componentes e responsividade visual.</w:t>
+            </w:r>
+          </w:p>
+        </w:tc>
+      </w:tr>
+      <w:tr>
+        <w:tc>
+          <w:tcPr>
+            <w:tcW w:type="dxa" w:w="4514"/>
+            <w:vAlign w:val="center"/>
+            <w:shd w:fill="F2F6FA"/>
+          </w:tcPr>
+          <w:p>
+            <w:r>
+              <w:rPr>
+                <w:sz w:val="16"/>
+              </w:rPr>
+              <w:t>MySQL 8.4 Reference Manual — https://dev.mysql.com/doc/refman/8.4/en/</w:t>
+            </w:r>
+          </w:p>
+        </w:tc>
+        <w:tc>
+          <w:tcPr>
+            <w:tcW w:type="dxa" w:w="4514"/>
+            <w:vAlign w:val="center"/>
+            <w:shd w:fill="F2F6FA"/>
+          </w:tcPr>
+          <w:p>
+            <w:r>
+              <w:rPr>
+                <w:sz w:val="16"/>
+              </w:rPr>
+              <w:t>DDL, tipos e integridade relacional.</w:t>
+            </w:r>
+          </w:p>
+        </w:tc>
+      </w:tr>
+      <w:tr>
+        <w:tc>
+          <w:tcPr>
+            <w:tcW w:type="dxa" w:w="4514"/>
+            <w:vAlign w:val="center"/>
+          </w:tcPr>
+          <w:p>
+            <w:r>
+              <w:rPr>
+                <w:sz w:val="16"/>
+              </w:rPr>
+              <w:t>Docker Compose Documentation — https://docs.docker.com/compose/</w:t>
+            </w:r>
+          </w:p>
+        </w:tc>
+        <w:tc>
+          <w:tcPr>
+            <w:tcW w:type="dxa" w:w="4514"/>
+            <w:vAlign w:val="center"/>
+          </w:tcPr>
+          <w:p>
+            <w:r>
+              <w:rPr>
+                <w:sz w:val="16"/>
+              </w:rPr>
+              <w:t>Provisionamento local do MySQL.</w:t>
+            </w:r>
+          </w:p>
+        </w:tc>
+      </w:tr>
+      <w:tr>
+        <w:tc>
+          <w:tcPr>
+            <w:tcW w:type="dxa" w:w="4514"/>
+            <w:vAlign w:val="center"/>
+            <w:shd w:fill="F2F6FA"/>
+          </w:tcPr>
+          <w:p>
+            <w:r>
+              <w:rPr>
+                <w:sz w:val="16"/>
+              </w:rPr>
+              <w:t>PlantUML Language Reference — https://plantuml.com/</w:t>
+            </w:r>
+          </w:p>
+        </w:tc>
+        <w:tc>
+          <w:tcPr>
+            <w:tcW w:type="dxa" w:w="4514"/>
+            <w:vAlign w:val="center"/>
+            <w:shd w:fill="F2F6FA"/>
+          </w:tcPr>
+          <w:p>
+            <w:r>
+              <w:rPr>
+                <w:sz w:val="16"/>
+              </w:rPr>
+              <w:t>Diagramas UML e DER.</w:t>
+            </w:r>
+          </w:p>
+        </w:tc>
+      </w:tr>
+    </w:tbl>
+    <w:p/>
+    <w:p>
+      <w:r>
+        <w:br w:type="page"/>
+      </w:r>
+    </w:p>
+    <w:p>
+      <w:pPr>
+        <w:pStyle w:val="Heading1"/>
+      </w:pPr>
+      <w:r>
+        <w:t>Apêndices e anexos</w:t>
+      </w:r>
+    </w:p>
+    <w:p>
+      <w:pPr>
+        <w:pStyle w:val="Heading2"/>
+      </w:pPr>
+      <w:r>
+        <w:t>Apêndice A — Instrumento de entrevista</w:t>
+      </w:r>
+    </w:p>
+    <w:p>
+      <w:r>
+        <w:t>Roteiro: perfil do participante; dificuldades para encontrar profissionais; informações necessárias para publicar uma demanda; critérios de confiança; expectativa sobre acompanhamento e avaliação. As respostas devem ser registradas de forma anonimizada.</w:t>
+      </w:r>
+    </w:p>
+    <w:p>
+      <w:pPr>
+        <w:pStyle w:val="Heading2"/>
+      </w:pPr>
+      <w:r>
+        <w:t>Apêndice B — Questionário</w:t>
+      </w:r>
+    </w:p>
+    <w:p>
+      <w:r>
+        <w:t>Itens: clareza da publicação; facilidade de consulta; confiança no aceite; compreensão dos status; facilidade para avaliar; percepção de acessibilidade. Escala sugerida: 1 a 5, com campo opcional de comentário.</w:t>
+      </w:r>
+    </w:p>
+    <w:p>
+      <w:pPr>
+        <w:pStyle w:val="Heading2"/>
+      </w:pPr>
+      <w:r>
+        <w:t>Apêndice C — Síntese das evidências de validação</w:t>
+      </w:r>
+    </w:p>
+    <w:tbl>
+      <w:tblPr>
+        <w:tblW w:type="auto" w:w="0"/>
+        <w:tblLook w:firstColumn="1" w:firstRow="1" w:lastColumn="0" w:lastRow="0" w:noHBand="0" w:noVBand="1" w:val="04A0"/>
+        <w:tblBorders>
+          <w:top w:val="single" w:sz="4" w:color="D9D9D9"/>
+          <w:left w:val="single" w:sz="4" w:color="D9D9D9"/>
+          <w:bottom w:val="single" w:sz="4" w:color="D9D9D9"/>
+          <w:right w:val="single" w:sz="4" w:color="D9D9D9"/>
+          <w:insideH w:val="single" w:sz="4" w:color="D9D9D9"/>
+          <w:insideV w:val="single" w:sz="4" w:color="D9D9D9"/>
+        </w:tblBorders>
+      </w:tblPr>
+      <w:tblGrid>
+        <w:gridCol w:w="4514"/>
+        <w:gridCol w:w="4514"/>
+      </w:tblGrid>
+      <w:tr>
+        <w:tc>
+          <w:tcPr>
+            <w:tcW w:type="dxa" w:w="4514"/>
+            <w:shd w:fill="1F4E78"/>
+          </w:tcPr>
+          <w:p>
+            <w:r>
+              <w:rPr>
+                <w:b/>
+                <w:color w:val="FFFFFF"/>
+                <w:sz w:val="16"/>
+              </w:rPr>
+              <w:t>Evidência</w:t>
+            </w:r>
+          </w:p>
+        </w:tc>
+        <w:tc>
+          <w:tcPr>
+            <w:tcW w:type="dxa" w:w="4514"/>
+            <w:shd w:fill="1F4E78"/>
+          </w:tcPr>
+          <w:p>
+            <w:r>
+              <w:rPr>
+                <w:b/>
+                <w:color w:val="FFFFFF"/>
+                <w:sz w:val="16"/>
+              </w:rPr>
+              <w:t>Registro</w:t>
+            </w:r>
+          </w:p>
+        </w:tc>
+      </w:tr>
+      <w:tr>
+        <w:tc>
+          <w:tcPr>
+            <w:tcW w:type="dxa" w:w="4514"/>
+            <w:vAlign w:val="center"/>
+          </w:tcPr>
+          <w:p>
+            <w:r>
+              <w:rPr>
+                <w:sz w:val="16"/>
+              </w:rPr>
+              <w:t>Participantes</w:t>
+            </w:r>
+          </w:p>
+        </w:tc>
+        <w:tc>
+          <w:tcPr>
+            <w:tcW w:type="dxa" w:w="4514"/>
+            <w:vAlign w:val="center"/>
+          </w:tcPr>
+          <w:p>
+            <w:r>
+              <w:rPr>
+                <w:sz w:val="16"/>
+              </w:rPr>
+              <w:t>Informar quantitativo real após aplicação; não inventar amostra.</w:t>
+            </w:r>
+          </w:p>
+        </w:tc>
+      </w:tr>
+      <w:tr>
+        <w:tc>
+          <w:tcPr>
+            <w:tcW w:type="dxa" w:w="4514"/>
+            <w:vAlign w:val="center"/>
+            <w:shd w:fill="F2F6FA"/>
+          </w:tcPr>
+          <w:p>
+            <w:r>
+              <w:rPr>
+                <w:sz w:val="16"/>
+              </w:rPr>
+              <w:t>Respostas</w:t>
+            </w:r>
+          </w:p>
+        </w:tc>
+        <w:tc>
+          <w:tcPr>
+            <w:tcW w:type="dxa" w:w="4514"/>
+            <w:vAlign w:val="center"/>
+            <w:shd w:fill="F2F6FA"/>
+          </w:tcPr>
+          <w:p>
+            <w:r>
+              <w:rPr>
+                <w:sz w:val="16"/>
+              </w:rPr>
+              <w:t>Anexar planilha ou relatório anonimizado em docs/evidencias/.</w:t>
+            </w:r>
+          </w:p>
+        </w:tc>
+      </w:tr>
+      <w:tr>
+        <w:tc>
+          <w:tcPr>
+            <w:tcW w:type="dxa" w:w="4514"/>
+            <w:vAlign w:val="center"/>
+          </w:tcPr>
+          <w:p>
+            <w:r>
+              <w:rPr>
+                <w:sz w:val="16"/>
+              </w:rPr>
+              <w:t>Decisões</w:t>
+            </w:r>
+          </w:p>
+        </w:tc>
+        <w:tc>
+          <w:tcPr>
+            <w:tcW w:type="dxa" w:w="4514"/>
+            <w:vAlign w:val="center"/>
+          </w:tcPr>
+          <w:p>
+            <w:r>
+              <w:rPr>
+                <w:sz w:val="16"/>
+              </w:rPr>
+              <w:t>Registrar alterações aprovadas nos requisitos, protótipos e fluxos.</w:t>
+            </w:r>
+          </w:p>
+        </w:tc>
+      </w:tr>
+      <w:tr>
+        <w:tc>
+          <w:tcPr>
+            <w:tcW w:type="dxa" w:w="4514"/>
+            <w:vAlign w:val="center"/>
+            <w:shd w:fill="F2F6FA"/>
+          </w:tcPr>
+          <w:p>
+            <w:r>
+              <w:rPr>
+                <w:sz w:val="16"/>
+              </w:rPr>
+              <w:t>Ata</w:t>
+            </w:r>
+          </w:p>
+        </w:tc>
+        <w:tc>
+          <w:tcPr>
+            <w:tcW w:type="dxa" w:w="4514"/>
+            <w:vAlign w:val="center"/>
+            <w:shd w:fill="F2F6FA"/>
+          </w:tcPr>
+          <w:p>
+            <w:r>
+              <w:rPr>
+                <w:sz w:val="16"/>
+              </w:rPr>
+              <w:t>Data, participantes, pauta, decisões e pendências.</w:t>
+            </w:r>
+          </w:p>
+        </w:tc>
+      </w:tr>
+    </w:tbl>
+    <w:p/>
+    <w:p>
+      <w:r>
+        <w:t>Os apêndices preservam os instrumentos originais e deixam explícito onde devem ser anexadas respostas anonimizadas, quantitativo de participantes e síntese dos resultados, fortalecendo a evidência sem expor dados pessoais.</w:t>
       </w:r>
     </w:p>
     <w:sectPr>

</xml_diff>